<commit_message>
fix: corregir acta de capacitacion AA13-EV01 (alineada con AA12-EV01) y agregar PDFs de material de formacion
</commit_message>
<xml_diff>
--- a/Actividad de proyecto 8/(13) Evidencia GA10-220501097-AA13-EV01. Documentación plan de capacitación y acta de entrega del proyecto de software/Evid. GA10-220501097-AA13-EV01 Documentación plan de capacitación y acta de entrega del proyecto de software..docx
+++ b/Actividad de proyecto 8/(13) Evidencia GA10-220501097-AA13-EV01. Documentación plan de capacitación y acta de entrega del proyecto de software/Evid. GA10-220501097-AA13-EV01 Documentación plan de capacitación y acta de entrega del proyecto de software..docx
@@ -1548,8 +1548,8 @@
           <w:color w:val="auto"/>
         </w:rPr>
       </w:pPr>
-      <w:bookmarkStart w:id="0" w:name="introducción"/>
-      <w:bookmarkStart w:id="1" w:name="_Toc241697232"/>
+      <w:bookmarkStart w:id="0" w:name="_Toc241697232"/>
+      <w:bookmarkStart w:id="1" w:name="introducción"/>
       <w:r>
         <w:rPr>
           <w:rFonts w:ascii="Times New Roman" w:hAnsi="Times New Roman" w:cs="Times New Roman"/>
@@ -1557,7 +1557,7 @@
         </w:rPr>
         <w:t>Introducción</w:t>
       </w:r>
-      <w:bookmarkEnd w:id="1"/>
+      <w:bookmarkEnd w:id="0"/>
     </w:p>
     <w:p>
       <w:pPr>
@@ -4107,9 +4107,9 @@
           <w:szCs w:val="28"/>
         </w:rPr>
       </w:pPr>
-      <w:bookmarkStart w:id="2" w:name="Xcfc8572a99a3dcff279f83830791a9dc136f591"/>
-      <w:bookmarkStart w:id="3" w:name="_Toc241697233"/>
-      <w:bookmarkEnd w:id="0"/>
+      <w:bookmarkStart w:id="2" w:name="_Toc241697233"/>
+      <w:bookmarkStart w:id="3" w:name="Xcfc8572a99a3dcff279f83830791a9dc136f591"/>
+      <w:bookmarkEnd w:id="1"/>
       <w:r>
         <w:rPr>
           <w:rFonts w:ascii="Times New Roman" w:hAnsi="Times New Roman" w:cs="Times New Roman"/>
@@ -4227,7 +4227,7 @@
         </w:rPr>
         <w:t>MATCH</w:t>
       </w:r>
-      <w:bookmarkEnd w:id="3"/>
+      <w:bookmarkEnd w:id="2"/>
     </w:p>
     <w:p>
       <w:pPr>
@@ -4644,6 +4644,28 @@
           <w:rFonts w:ascii="Times New Roman" w:hAnsi="Times New Roman" w:cs="Times New Roman"/>
         </w:rPr>
         <w:t>_______</w:t>
+      </w:r>
+    </w:p>
+    <w:p>
+      <w:pPr>
+        <w:pStyle w:val="Textoindependiente"/>
+        <w:spacing w:line="360" w:lineRule="auto"/>
+        <w:rPr>
+          <w:rFonts w:ascii="Times New Roman" w:hAnsi="Times New Roman" w:cs="Times New Roman"/>
+        </w:rPr>
+      </w:pPr>
+      <w:r>
+        <w:rPr>
+          <w:rFonts w:ascii="Times New Roman" w:hAnsi="Times New Roman"/>
+          <w:b/>
+        </w:rPr>
+        <w:t xml:space="preserve">Video tutorial de apoyo: </w:t>
+      </w:r>
+      <w:r>
+        <w:rPr>
+          <w:rFonts w:ascii="Times New Roman" w:hAnsi="Times New Roman"/>
+        </w:rPr>
+        <w:t>https://youtu.be/bvpmzarjK6U</w:t>
       </w:r>
     </w:p>
     <w:p>
@@ -4824,251 +4846,16 @@
       </w:pPr>
       <w:r>
         <w:rPr>
-          <w:rFonts w:ascii="Times New Roman" w:hAnsi="Times New Roman" w:cs="Times New Roman"/>
+          <w:rFonts w:ascii="Times New Roman" w:hAnsi="Times New Roman"/>
           <w:b/>
-          <w:bCs/>
-        </w:rPr>
-        <w:t>Asistentes:</w:t>
-      </w:r>
-      <w:r>
-        <w:rPr>
-          <w:rFonts w:ascii="Times New Roman" w:hAnsi="Times New Roman" w:cs="Times New Roman"/>
-        </w:rPr>
-        <w:t xml:space="preserve"> </w:t>
-      </w:r>
-      <w:r>
-        <w:rPr>
-          <w:rFonts w:ascii="Times New Roman" w:hAnsi="Times New Roman" w:cs="Times New Roman"/>
-        </w:rPr>
-        <w:t>Usuarios</w:t>
-      </w:r>
-      <w:r>
-        <w:rPr>
-          <w:rFonts w:ascii="Times New Roman" w:hAnsi="Times New Roman" w:cs="Times New Roman"/>
-        </w:rPr>
-        <w:t xml:space="preserve"> </w:t>
-      </w:r>
-      <w:r>
-        <w:rPr>
-          <w:rFonts w:ascii="Times New Roman" w:hAnsi="Times New Roman" w:cs="Times New Roman"/>
-        </w:rPr>
-        <w:t>finales</w:t>
-      </w:r>
-      <w:r>
-        <w:rPr>
-          <w:rFonts w:ascii="Times New Roman" w:hAnsi="Times New Roman" w:cs="Times New Roman"/>
-        </w:rPr>
-        <w:t xml:space="preserve"> </w:t>
-      </w:r>
-      <w:r>
-        <w:rPr>
-          <w:rFonts w:ascii="Times New Roman" w:hAnsi="Times New Roman" w:cs="Times New Roman"/>
-        </w:rPr>
-        <w:t>de</w:t>
-      </w:r>
-      <w:r>
-        <w:rPr>
-          <w:rFonts w:ascii="Times New Roman" w:hAnsi="Times New Roman" w:cs="Times New Roman"/>
-        </w:rPr>
-        <w:t xml:space="preserve"> </w:t>
-      </w:r>
-      <w:r>
-        <w:rPr>
-          <w:rFonts w:ascii="Times New Roman" w:hAnsi="Times New Roman" w:cs="Times New Roman"/>
-        </w:rPr>
-        <w:t>la</w:t>
-      </w:r>
-      <w:r>
-        <w:rPr>
-          <w:rFonts w:ascii="Times New Roman" w:hAnsi="Times New Roman" w:cs="Times New Roman"/>
-        </w:rPr>
-        <w:t xml:space="preserve"> </w:t>
-      </w:r>
-      <w:r>
-        <w:rPr>
-          <w:rFonts w:ascii="Times New Roman" w:hAnsi="Times New Roman" w:cs="Times New Roman"/>
-        </w:rPr>
-        <w:t>plataforma</w:t>
-      </w:r>
-      <w:r>
-        <w:rPr>
-          <w:rFonts w:ascii="Times New Roman" w:hAnsi="Times New Roman" w:cs="Times New Roman"/>
-        </w:rPr>
-        <w:t xml:space="preserve"> </w:t>
-      </w:r>
-      <w:r>
-        <w:rPr>
-          <w:rFonts w:ascii="Times New Roman" w:hAnsi="Times New Roman" w:cs="Times New Roman"/>
-        </w:rPr>
-        <w:t>(usuarios</w:t>
-      </w:r>
-      <w:r>
-        <w:rPr>
-          <w:rFonts w:ascii="Times New Roman" w:hAnsi="Times New Roman" w:cs="Times New Roman"/>
-        </w:rPr>
-        <w:t xml:space="preserve"> </w:t>
-      </w:r>
-      <w:r>
-        <w:rPr>
-          <w:rFonts w:ascii="Times New Roman" w:hAnsi="Times New Roman" w:cs="Times New Roman"/>
-        </w:rPr>
-        <w:t>estándar</w:t>
-      </w:r>
-      <w:r>
-        <w:rPr>
-          <w:rFonts w:ascii="Times New Roman" w:hAnsi="Times New Roman" w:cs="Times New Roman"/>
-        </w:rPr>
-        <w:t xml:space="preserve"> </w:t>
-      </w:r>
-      <w:r>
-        <w:rPr>
-          <w:rFonts w:ascii="Times New Roman" w:hAnsi="Times New Roman" w:cs="Times New Roman"/>
-        </w:rPr>
-        <w:t>que</w:t>
-      </w:r>
-      <w:r>
-        <w:rPr>
-          <w:rFonts w:ascii="Times New Roman" w:hAnsi="Times New Roman" w:cs="Times New Roman"/>
-        </w:rPr>
-        <w:t xml:space="preserve"> </w:t>
-      </w:r>
-      <w:r>
-        <w:rPr>
-          <w:rFonts w:ascii="Times New Roman" w:hAnsi="Times New Roman" w:cs="Times New Roman"/>
-        </w:rPr>
-        <w:t>publican</w:t>
-      </w:r>
-      <w:r>
-        <w:rPr>
-          <w:rFonts w:ascii="Times New Roman" w:hAnsi="Times New Roman" w:cs="Times New Roman"/>
-        </w:rPr>
-        <w:t xml:space="preserve"> </w:t>
-      </w:r>
-      <w:r>
-        <w:rPr>
-          <w:rFonts w:ascii="Times New Roman" w:hAnsi="Times New Roman" w:cs="Times New Roman"/>
-        </w:rPr>
-        <w:t>e</w:t>
-      </w:r>
-      <w:r>
-        <w:rPr>
-          <w:rFonts w:ascii="Times New Roman" w:hAnsi="Times New Roman" w:cs="Times New Roman"/>
-        </w:rPr>
-        <w:t xml:space="preserve"> </w:t>
-      </w:r>
-      <w:r>
-        <w:rPr>
-          <w:rFonts w:ascii="Times New Roman" w:hAnsi="Times New Roman" w:cs="Times New Roman"/>
-        </w:rPr>
-        <w:t>intercambian</w:t>
-      </w:r>
-      <w:r>
-        <w:rPr>
-          <w:rFonts w:ascii="Times New Roman" w:hAnsi="Times New Roman" w:cs="Times New Roman"/>
-        </w:rPr>
-        <w:t xml:space="preserve"> </w:t>
-      </w:r>
-      <w:r>
-        <w:rPr>
-          <w:rFonts w:ascii="Times New Roman" w:hAnsi="Times New Roman" w:cs="Times New Roman"/>
-        </w:rPr>
-        <w:t>ofertas)</w:t>
-      </w:r>
-      <w:r>
-        <w:rPr>
-          <w:rFonts w:ascii="Times New Roman" w:hAnsi="Times New Roman" w:cs="Times New Roman"/>
-        </w:rPr>
-        <w:t xml:space="preserve"> </w:t>
-      </w:r>
-      <w:r>
-        <w:rPr>
-          <w:rFonts w:ascii="Times New Roman" w:hAnsi="Times New Roman" w:cs="Times New Roman"/>
-        </w:rPr>
-        <w:t>y</w:t>
-      </w:r>
-      <w:r>
-        <w:rPr>
-          <w:rFonts w:ascii="Times New Roman" w:hAnsi="Times New Roman" w:cs="Times New Roman"/>
-        </w:rPr>
-        <w:t xml:space="preserve"> </w:t>
-      </w:r>
-      <w:r>
-        <w:rPr>
-          <w:rFonts w:ascii="Times New Roman" w:hAnsi="Times New Roman" w:cs="Times New Roman"/>
-        </w:rPr>
-        <w:t>personal</w:t>
-      </w:r>
-      <w:r>
-        <w:rPr>
-          <w:rFonts w:ascii="Times New Roman" w:hAnsi="Times New Roman" w:cs="Times New Roman"/>
-        </w:rPr>
-        <w:t xml:space="preserve"> </w:t>
-      </w:r>
-      <w:r>
-        <w:rPr>
-          <w:rFonts w:ascii="Times New Roman" w:hAnsi="Times New Roman" w:cs="Times New Roman"/>
-        </w:rPr>
-        <w:t>con</w:t>
-      </w:r>
-      <w:r>
-        <w:rPr>
-          <w:rFonts w:ascii="Times New Roman" w:hAnsi="Times New Roman" w:cs="Times New Roman"/>
-        </w:rPr>
-        <w:t xml:space="preserve"> </w:t>
-      </w:r>
-      <w:r>
-        <w:rPr>
-          <w:rFonts w:ascii="Times New Roman" w:hAnsi="Times New Roman" w:cs="Times New Roman"/>
-        </w:rPr>
-        <w:t>rol</w:t>
-      </w:r>
-      <w:r>
-        <w:rPr>
-          <w:rFonts w:ascii="Times New Roman" w:hAnsi="Times New Roman" w:cs="Times New Roman"/>
-        </w:rPr>
-        <w:t xml:space="preserve"> </w:t>
-      </w:r>
-      <w:r>
-        <w:rPr>
-          <w:rFonts w:ascii="Times New Roman" w:hAnsi="Times New Roman" w:cs="Times New Roman"/>
-        </w:rPr>
-        <w:t>de</w:t>
-      </w:r>
-      <w:r>
-        <w:rPr>
-          <w:rFonts w:ascii="Times New Roman" w:hAnsi="Times New Roman" w:cs="Times New Roman"/>
-        </w:rPr>
-        <w:t xml:space="preserve"> </w:t>
-      </w:r>
-      <w:r>
-        <w:rPr>
-          <w:rFonts w:ascii="Times New Roman" w:hAnsi="Times New Roman" w:cs="Times New Roman"/>
-        </w:rPr>
-        <w:t>administrador</w:t>
-      </w:r>
-      <w:r>
-        <w:rPr>
-          <w:rFonts w:ascii="Times New Roman" w:hAnsi="Times New Roman" w:cs="Times New Roman"/>
-        </w:rPr>
-        <w:t xml:space="preserve"> </w:t>
-      </w:r>
-      <w:r>
-        <w:rPr>
-          <w:rFonts w:ascii="Times New Roman" w:hAnsi="Times New Roman" w:cs="Times New Roman"/>
-        </w:rPr>
-        <w:t>del</w:t>
-      </w:r>
-      <w:r>
-        <w:rPr>
-          <w:rFonts w:ascii="Times New Roman" w:hAnsi="Times New Roman" w:cs="Times New Roman"/>
-        </w:rPr>
-        <w:t xml:space="preserve"> </w:t>
-      </w:r>
-      <w:r>
-        <w:rPr>
-          <w:rFonts w:ascii="Times New Roman" w:hAnsi="Times New Roman" w:cs="Times New Roman"/>
-        </w:rPr>
-        <w:t>sistema.</w:t>
+        </w:rPr>
+        <w:t xml:space="preserve">Asistentes: </w:t>
+      </w:r>
+      <w:r>
+        <w:rPr>
+          <w:rFonts w:ascii="Times New Roman" w:hAnsi="Times New Roman"/>
+        </w:rPr>
+        <w:t>Sandra, usuaria final de la plataforma (rol de usuario estándar, encargada de publicar ofertas y realizar trueques).</w:t>
       </w:r>
     </w:p>
     <w:p>
@@ -6130,7 +5917,7 @@
           <w:b/>
           <w:bCs/>
         </w:rPr>
-        <w:t>Roles</w:t>
+        <w:t>Registro</w:t>
       </w:r>
       <w:r>
         <w:rPr>
@@ -6146,7 +5933,7 @@
           <w:b/>
           <w:bCs/>
         </w:rPr>
-        <w:t>de</w:t>
+        <w:t>e</w:t>
       </w:r>
       <w:r>
         <w:rPr>
@@ -6162,61 +5949,7 @@
           <w:b/>
           <w:bCs/>
         </w:rPr>
-        <w:t>usuario.</w:t>
-      </w:r>
-      <w:r>
-        <w:rPr>
-          <w:rFonts w:ascii="Times New Roman" w:hAnsi="Times New Roman" w:cs="Times New Roman"/>
-        </w:rPr>
-        <w:t xml:space="preserve"> </w:t>
-      </w:r>
-      <w:r>
-        <w:rPr>
-          <w:rFonts w:ascii="Times New Roman" w:hAnsi="Times New Roman" w:cs="Times New Roman"/>
-        </w:rPr>
-        <w:t>Diferencias</w:t>
-      </w:r>
-      <w:r>
-        <w:rPr>
-          <w:rFonts w:ascii="Times New Roman" w:hAnsi="Times New Roman" w:cs="Times New Roman"/>
-        </w:rPr>
-        <w:t xml:space="preserve"> </w:t>
-      </w:r>
-      <w:r>
-        <w:rPr>
-          <w:rFonts w:ascii="Times New Roman" w:hAnsi="Times New Roman" w:cs="Times New Roman"/>
-        </w:rPr>
-        <w:t>entre</w:t>
-      </w:r>
-      <w:r>
-        <w:rPr>
-          <w:rFonts w:ascii="Times New Roman" w:hAnsi="Times New Roman" w:cs="Times New Roman"/>
-        </w:rPr>
-        <w:t xml:space="preserve"> </w:t>
-      </w:r>
-      <w:r>
-        <w:rPr>
-          <w:rFonts w:ascii="Times New Roman" w:hAnsi="Times New Roman" w:cs="Times New Roman"/>
-        </w:rPr>
-        <w:t>el</w:t>
-      </w:r>
-      <w:r>
-        <w:rPr>
-          <w:rFonts w:ascii="Times New Roman" w:hAnsi="Times New Roman" w:cs="Times New Roman"/>
-        </w:rPr>
-        <w:t xml:space="preserve"> </w:t>
-      </w:r>
-      <w:r>
-        <w:rPr>
-          <w:rFonts w:ascii="Times New Roman" w:hAnsi="Times New Roman" w:cs="Times New Roman"/>
-        </w:rPr>
-        <w:t>rol</w:t>
-      </w:r>
-      <w:r>
-        <w:rPr>
-          <w:rFonts w:ascii="Times New Roman" w:hAnsi="Times New Roman" w:cs="Times New Roman"/>
-        </w:rPr>
-        <w:t xml:space="preserve"> </w:t>
+        <w:t>inicio</w:t>
       </w:r>
       <w:r>
         <w:rPr>
@@ -6224,7 +5957,7 @@
           <w:b/>
           <w:bCs/>
         </w:rPr>
-        <w:t>Usuario</w:t>
+        <w:t xml:space="preserve"> </w:t>
       </w:r>
       <w:r>
         <w:rPr>
@@ -6232,7 +5965,7 @@
           <w:b/>
           <w:bCs/>
         </w:rPr>
-        <w:t xml:space="preserve"> </w:t>
+        <w:t>de</w:t>
       </w:r>
       <w:r>
         <w:rPr>
@@ -6240,144 +5973,6 @@
           <w:b/>
           <w:bCs/>
         </w:rPr>
-        <w:t>estándar</w:t>
-      </w:r>
-      <w:r>
-        <w:rPr>
-          <w:rFonts w:ascii="Times New Roman" w:hAnsi="Times New Roman" w:cs="Times New Roman"/>
-        </w:rPr>
-        <w:t xml:space="preserve"> </w:t>
-      </w:r>
-      <w:r>
-        <w:rPr>
-          <w:rFonts w:ascii="Times New Roman" w:hAnsi="Times New Roman" w:cs="Times New Roman"/>
-        </w:rPr>
-        <w:t>(publica</w:t>
-      </w:r>
-      <w:r>
-        <w:rPr>
-          <w:rFonts w:ascii="Times New Roman" w:hAnsi="Times New Roman" w:cs="Times New Roman"/>
-        </w:rPr>
-        <w:t xml:space="preserve"> </w:t>
-      </w:r>
-      <w:r>
-        <w:rPr>
-          <w:rFonts w:ascii="Times New Roman" w:hAnsi="Times New Roman" w:cs="Times New Roman"/>
-        </w:rPr>
-        <w:t>ofertas,</w:t>
-      </w:r>
-      <w:r>
-        <w:rPr>
-          <w:rFonts w:ascii="Times New Roman" w:hAnsi="Times New Roman" w:cs="Times New Roman"/>
-        </w:rPr>
-        <w:t xml:space="preserve"> </w:t>
-      </w:r>
-      <w:r>
-        <w:rPr>
-          <w:rFonts w:ascii="Times New Roman" w:hAnsi="Times New Roman" w:cs="Times New Roman"/>
-        </w:rPr>
-        <w:t>propone</w:t>
-      </w:r>
-      <w:r>
-        <w:rPr>
-          <w:rFonts w:ascii="Times New Roman" w:hAnsi="Times New Roman" w:cs="Times New Roman"/>
-        </w:rPr>
-        <w:t xml:space="preserve"> </w:t>
-      </w:r>
-      <w:r>
-        <w:rPr>
-          <w:rFonts w:ascii="Times New Roman" w:hAnsi="Times New Roman" w:cs="Times New Roman"/>
-        </w:rPr>
-        <w:t>y</w:t>
-      </w:r>
-      <w:r>
-        <w:rPr>
-          <w:rFonts w:ascii="Times New Roman" w:hAnsi="Times New Roman" w:cs="Times New Roman"/>
-        </w:rPr>
-        <w:t xml:space="preserve"> </w:t>
-      </w:r>
-      <w:r>
-        <w:rPr>
-          <w:rFonts w:ascii="Times New Roman" w:hAnsi="Times New Roman" w:cs="Times New Roman"/>
-        </w:rPr>
-        <w:t>gestiona</w:t>
-      </w:r>
-      <w:r>
-        <w:rPr>
-          <w:rFonts w:ascii="Times New Roman" w:hAnsi="Times New Roman" w:cs="Times New Roman"/>
-        </w:rPr>
-        <w:t xml:space="preserve"> </w:t>
-      </w:r>
-      <w:r>
-        <w:rPr>
-          <w:rFonts w:ascii="Times New Roman" w:hAnsi="Times New Roman" w:cs="Times New Roman"/>
-        </w:rPr>
-        <w:t>sus</w:t>
-      </w:r>
-      <w:r>
-        <w:rPr>
-          <w:rFonts w:ascii="Times New Roman" w:hAnsi="Times New Roman" w:cs="Times New Roman"/>
-        </w:rPr>
-        <w:t xml:space="preserve"> </w:t>
-      </w:r>
-      <w:r>
-        <w:rPr>
-          <w:rFonts w:ascii="Times New Roman" w:hAnsi="Times New Roman" w:cs="Times New Roman"/>
-        </w:rPr>
-        <w:t>propios</w:t>
-      </w:r>
-      <w:r>
-        <w:rPr>
-          <w:rFonts w:ascii="Times New Roman" w:hAnsi="Times New Roman" w:cs="Times New Roman"/>
-        </w:rPr>
-        <w:t xml:space="preserve"> </w:t>
-      </w:r>
-      <w:r>
-        <w:rPr>
-          <w:rFonts w:ascii="Times New Roman" w:hAnsi="Times New Roman" w:cs="Times New Roman"/>
-        </w:rPr>
-        <w:t>trueques)</w:t>
-      </w:r>
-      <w:r>
-        <w:rPr>
-          <w:rFonts w:ascii="Times New Roman" w:hAnsi="Times New Roman" w:cs="Times New Roman"/>
-        </w:rPr>
-        <w:t xml:space="preserve"> </w:t>
-      </w:r>
-      <w:r>
-        <w:rPr>
-          <w:rFonts w:ascii="Times New Roman" w:hAnsi="Times New Roman" w:cs="Times New Roman"/>
-        </w:rPr>
-        <w:t>y</w:t>
-      </w:r>
-      <w:r>
-        <w:rPr>
-          <w:rFonts w:ascii="Times New Roman" w:hAnsi="Times New Roman" w:cs="Times New Roman"/>
-        </w:rPr>
-        <w:t xml:space="preserve"> </w:t>
-      </w:r>
-      <w:r>
-        <w:rPr>
-          <w:rFonts w:ascii="Times New Roman" w:hAnsi="Times New Roman" w:cs="Times New Roman"/>
-        </w:rPr>
-        <w:t>el</w:t>
-      </w:r>
-      <w:r>
-        <w:rPr>
-          <w:rFonts w:ascii="Times New Roman" w:hAnsi="Times New Roman" w:cs="Times New Roman"/>
-        </w:rPr>
-        <w:t xml:space="preserve"> </w:t>
-      </w:r>
-      <w:r>
-        <w:rPr>
-          <w:rFonts w:ascii="Times New Roman" w:hAnsi="Times New Roman" w:cs="Times New Roman"/>
-        </w:rPr>
-        <w:t>rol</w:t>
-      </w:r>
-      <w:r>
-        <w:rPr>
-          <w:rFonts w:ascii="Times New Roman" w:hAnsi="Times New Roman" w:cs="Times New Roman"/>
-        </w:rPr>
         <w:t xml:space="preserve"> </w:t>
       </w:r>
       <w:r>
@@ -6386,55 +5981,103 @@
           <w:b/>
           <w:bCs/>
         </w:rPr>
-        <w:t>Administrador</w:t>
-      </w:r>
-      <w:r>
-        <w:rPr>
-          <w:rFonts w:ascii="Times New Roman" w:hAnsi="Times New Roman" w:cs="Times New Roman"/>
-        </w:rPr>
-        <w:t xml:space="preserve"> </w:t>
-      </w:r>
-      <w:r>
-        <w:rPr>
-          <w:rFonts w:ascii="Times New Roman" w:hAnsi="Times New Roman" w:cs="Times New Roman"/>
-        </w:rPr>
-        <w:t>(gestiona</w:t>
-      </w:r>
-      <w:r>
-        <w:rPr>
-          <w:rFonts w:ascii="Times New Roman" w:hAnsi="Times New Roman" w:cs="Times New Roman"/>
-        </w:rPr>
-        <w:t xml:space="preserve"> </w:t>
-      </w:r>
-      <w:r>
-        <w:rPr>
-          <w:rFonts w:ascii="Times New Roman" w:hAnsi="Times New Roman" w:cs="Times New Roman"/>
-        </w:rPr>
-        <w:t>usuarios,</w:t>
-      </w:r>
-      <w:r>
-        <w:rPr>
-          <w:rFonts w:ascii="Times New Roman" w:hAnsi="Times New Roman" w:cs="Times New Roman"/>
-        </w:rPr>
-        <w:t xml:space="preserve"> </w:t>
-      </w:r>
-      <w:r>
-        <w:rPr>
-          <w:rFonts w:ascii="Times New Roman" w:hAnsi="Times New Roman" w:cs="Times New Roman"/>
-        </w:rPr>
-        <w:t>ofertas,</w:t>
-      </w:r>
-      <w:r>
-        <w:rPr>
-          <w:rFonts w:ascii="Times New Roman" w:hAnsi="Times New Roman" w:cs="Times New Roman"/>
-        </w:rPr>
-        <w:t xml:space="preserve"> </w:t>
-      </w:r>
-      <w:r>
-        <w:rPr>
-          <w:rFonts w:ascii="Times New Roman" w:hAnsi="Times New Roman" w:cs="Times New Roman"/>
-        </w:rPr>
-        <w:t>trueques</w:t>
+        <w:t>sesión.</w:t>
+      </w:r>
+      <w:r>
+        <w:rPr>
+          <w:rFonts w:ascii="Times New Roman" w:hAnsi="Times New Roman" w:cs="Times New Roman"/>
+        </w:rPr>
+        <w:t xml:space="preserve"> </w:t>
+      </w:r>
+      <w:r>
+        <w:rPr>
+          <w:rFonts w:ascii="Times New Roman" w:hAnsi="Times New Roman" w:cs="Times New Roman"/>
+        </w:rPr>
+        <w:t>Cómo</w:t>
+      </w:r>
+      <w:r>
+        <w:rPr>
+          <w:rFonts w:ascii="Times New Roman" w:hAnsi="Times New Roman" w:cs="Times New Roman"/>
+        </w:rPr>
+        <w:t xml:space="preserve"> </w:t>
+      </w:r>
+      <w:r>
+        <w:rPr>
+          <w:rFonts w:ascii="Times New Roman" w:hAnsi="Times New Roman" w:cs="Times New Roman"/>
+        </w:rPr>
+        <w:t>crear</w:t>
+      </w:r>
+      <w:r>
+        <w:rPr>
+          <w:rFonts w:ascii="Times New Roman" w:hAnsi="Times New Roman" w:cs="Times New Roman"/>
+        </w:rPr>
+        <w:t xml:space="preserve"> </w:t>
+      </w:r>
+      <w:r>
+        <w:rPr>
+          <w:rFonts w:ascii="Times New Roman" w:hAnsi="Times New Roman" w:cs="Times New Roman"/>
+        </w:rPr>
+        <w:t>una</w:t>
+      </w:r>
+      <w:r>
+        <w:rPr>
+          <w:rFonts w:ascii="Times New Roman" w:hAnsi="Times New Roman" w:cs="Times New Roman"/>
+        </w:rPr>
+        <w:t xml:space="preserve"> </w:t>
+      </w:r>
+      <w:r>
+        <w:rPr>
+          <w:rFonts w:ascii="Times New Roman" w:hAnsi="Times New Roman" w:cs="Times New Roman"/>
+        </w:rPr>
+        <w:t>cuenta</w:t>
+      </w:r>
+      <w:r>
+        <w:rPr>
+          <w:rFonts w:ascii="Times New Roman" w:hAnsi="Times New Roman" w:cs="Times New Roman"/>
+        </w:rPr>
+        <w:t xml:space="preserve"> </w:t>
+      </w:r>
+      <w:r>
+        <w:rPr>
+          <w:rFonts w:ascii="Times New Roman" w:hAnsi="Times New Roman" w:cs="Times New Roman"/>
+        </w:rPr>
+        <w:t>nueva,</w:t>
+      </w:r>
+      <w:r>
+        <w:rPr>
+          <w:rFonts w:ascii="Times New Roman" w:hAnsi="Times New Roman" w:cs="Times New Roman"/>
+        </w:rPr>
+        <w:t xml:space="preserve"> </w:t>
+      </w:r>
+      <w:r>
+        <w:rPr>
+          <w:rFonts w:ascii="Times New Roman" w:hAnsi="Times New Roman" w:cs="Times New Roman"/>
+        </w:rPr>
+        <w:t>los</w:t>
+      </w:r>
+      <w:r>
+        <w:rPr>
+          <w:rFonts w:ascii="Times New Roman" w:hAnsi="Times New Roman" w:cs="Times New Roman"/>
+        </w:rPr>
+        <w:t xml:space="preserve"> </w:t>
+      </w:r>
+      <w:r>
+        <w:rPr>
+          <w:rFonts w:ascii="Times New Roman" w:hAnsi="Times New Roman" w:cs="Times New Roman"/>
+        </w:rPr>
+        <w:t>datos</w:t>
+      </w:r>
+      <w:r>
+        <w:rPr>
+          <w:rFonts w:ascii="Times New Roman" w:hAnsi="Times New Roman" w:cs="Times New Roman"/>
+        </w:rPr>
+        <w:t xml:space="preserve"> </w:t>
+      </w:r>
+      <w:r>
+        <w:rPr>
+          <w:rFonts w:ascii="Times New Roman" w:hAnsi="Times New Roman" w:cs="Times New Roman"/>
+        </w:rPr>
+        <w:t>obligatorios,</w:t>
       </w:r>
       <w:r>
         <w:rPr>
@@ -6458,7 +6101,31 @@
         <w:rPr>
           <w:rFonts w:ascii="Times New Roman" w:hAnsi="Times New Roman" w:cs="Times New Roman"/>
         </w:rPr>
-        <w:t>reportes</w:t>
+        <w:t>cómo</w:t>
+      </w:r>
+      <w:r>
+        <w:rPr>
+          <w:rFonts w:ascii="Times New Roman" w:hAnsi="Times New Roman" w:cs="Times New Roman"/>
+        </w:rPr>
+        <w:t xml:space="preserve"> </w:t>
+      </w:r>
+      <w:r>
+        <w:rPr>
+          <w:rFonts w:ascii="Times New Roman" w:hAnsi="Times New Roman" w:cs="Times New Roman"/>
+        </w:rPr>
+        <w:t>iniciar</w:t>
+      </w:r>
+      <w:r>
+        <w:rPr>
+          <w:rFonts w:ascii="Times New Roman" w:hAnsi="Times New Roman" w:cs="Times New Roman"/>
+        </w:rPr>
+        <w:t xml:space="preserve"> </w:t>
+      </w:r>
+      <w:r>
+        <w:rPr>
+          <w:rFonts w:ascii="Times New Roman" w:hAnsi="Times New Roman" w:cs="Times New Roman"/>
+        </w:rPr>
+        <w:t>sesión</w:t>
       </w:r>
       <w:r>
         <w:rPr>
@@ -6482,31 +6149,19 @@
         <w:rPr>
           <w:rFonts w:ascii="Times New Roman" w:hAnsi="Times New Roman" w:cs="Times New Roman"/>
         </w:rPr>
-        <w:t>toda</w:t>
-      </w:r>
-      <w:r>
-        <w:rPr>
-          <w:rFonts w:ascii="Times New Roman" w:hAnsi="Times New Roman" w:cs="Times New Roman"/>
-        </w:rPr>
-        <w:t xml:space="preserve"> </w:t>
-      </w:r>
-      <w:r>
-        <w:rPr>
-          <w:rFonts w:ascii="Times New Roman" w:hAnsi="Times New Roman" w:cs="Times New Roman"/>
-        </w:rPr>
-        <w:t>la</w:t>
-      </w:r>
-      <w:r>
-        <w:rPr>
-          <w:rFonts w:ascii="Times New Roman" w:hAnsi="Times New Roman" w:cs="Times New Roman"/>
-        </w:rPr>
-        <w:t xml:space="preserve"> </w:t>
-      </w:r>
-      <w:r>
-        <w:rPr>
-          <w:rFonts w:ascii="Times New Roman" w:hAnsi="Times New Roman" w:cs="Times New Roman"/>
-        </w:rPr>
-        <w:t>plataforma).</w:t>
+        <w:t>forma</w:t>
+      </w:r>
+      <w:r>
+        <w:rPr>
+          <w:rFonts w:ascii="Times New Roman" w:hAnsi="Times New Roman" w:cs="Times New Roman"/>
+        </w:rPr>
+        <w:t xml:space="preserve"> </w:t>
+      </w:r>
+      <w:r>
+        <w:rPr>
+          <w:rFonts w:ascii="Times New Roman" w:hAnsi="Times New Roman" w:cs="Times New Roman"/>
+        </w:rPr>
+        <w:t>segura.</w:t>
       </w:r>
     </w:p>
     <w:p>
@@ -6526,7 +6181,7 @@
           <w:b/>
           <w:bCs/>
         </w:rPr>
-        <w:t>Registro</w:t>
+        <w:t>Gestión</w:t>
       </w:r>
       <w:r>
         <w:rPr>
@@ -6542,7 +6197,7 @@
           <w:b/>
           <w:bCs/>
         </w:rPr>
-        <w:t>e</w:t>
+        <w:t>del</w:t>
       </w:r>
       <w:r>
         <w:rPr>
@@ -6558,7 +6213,49 @@
           <w:b/>
           <w:bCs/>
         </w:rPr>
-        <w:t>inicio</w:t>
+        <w:t>perfil.</w:t>
+      </w:r>
+      <w:r>
+        <w:rPr>
+          <w:rFonts w:ascii="Times New Roman" w:hAnsi="Times New Roman" w:cs="Times New Roman"/>
+        </w:rPr>
+        <w:t xml:space="preserve"> </w:t>
+      </w:r>
+      <w:r>
+        <w:rPr>
+          <w:rFonts w:ascii="Times New Roman" w:hAnsi="Times New Roman" w:cs="Times New Roman"/>
+        </w:rPr>
+        <w:t>Cómo</w:t>
+      </w:r>
+      <w:r>
+        <w:rPr>
+          <w:rFonts w:ascii="Times New Roman" w:hAnsi="Times New Roman" w:cs="Times New Roman"/>
+        </w:rPr>
+        <w:t xml:space="preserve"> </w:t>
+      </w:r>
+      <w:r>
+        <w:rPr>
+          <w:rFonts w:ascii="Times New Roman" w:hAnsi="Times New Roman" w:cs="Times New Roman"/>
+        </w:rPr>
+        <w:t>consultar</w:t>
+      </w:r>
+      <w:r>
+        <w:rPr>
+          <w:rFonts w:ascii="Times New Roman" w:hAnsi="Times New Roman" w:cs="Times New Roman"/>
+        </w:rPr>
+        <w:t xml:space="preserve"> </w:t>
+      </w:r>
+      <w:r>
+        <w:rPr>
+          <w:rFonts w:ascii="Times New Roman" w:hAnsi="Times New Roman" w:cs="Times New Roman"/>
+        </w:rPr>
+        <w:t>y</w:t>
+      </w:r>
+      <w:r>
+        <w:rPr>
+          <w:rFonts w:ascii="Times New Roman" w:hAnsi="Times New Roman" w:cs="Times New Roman"/>
+        </w:rPr>
+        <w:t xml:space="preserve"> </w:t>
       </w:r>
       <w:r>
         <w:rPr>
@@ -6566,7 +6263,7 @@
           <w:b/>
           <w:bCs/>
         </w:rPr>
-        <w:t xml:space="preserve"> </w:t>
+        <w:t>editar</w:t>
       </w:r>
       <w:r>
         <w:rPr>
@@ -6574,7 +6271,7 @@
           <w:b/>
           <w:bCs/>
         </w:rPr>
-        <w:t>de</w:t>
+        <w:t xml:space="preserve"> </w:t>
       </w:r>
       <w:r>
         <w:rPr>
@@ -6582,7 +6279,7 @@
           <w:b/>
           <w:bCs/>
         </w:rPr>
-        <w:t xml:space="preserve"> </w:t>
+        <w:t>los</w:t>
       </w:r>
       <w:r>
         <w:rPr>
@@ -6590,151 +6287,191 @@
           <w:b/>
           <w:bCs/>
         </w:rPr>
-        <w:t>sesión.</w:t>
-      </w:r>
-      <w:r>
-        <w:rPr>
-          <w:rFonts w:ascii="Times New Roman" w:hAnsi="Times New Roman" w:cs="Times New Roman"/>
-        </w:rPr>
-        <w:t xml:space="preserve"> </w:t>
-      </w:r>
-      <w:r>
-        <w:rPr>
-          <w:rFonts w:ascii="Times New Roman" w:hAnsi="Times New Roman" w:cs="Times New Roman"/>
-        </w:rPr>
-        <w:t>Cómo</w:t>
-      </w:r>
-      <w:r>
-        <w:rPr>
-          <w:rFonts w:ascii="Times New Roman" w:hAnsi="Times New Roman" w:cs="Times New Roman"/>
-        </w:rPr>
-        <w:t xml:space="preserve"> </w:t>
-      </w:r>
-      <w:r>
-        <w:rPr>
-          <w:rFonts w:ascii="Times New Roman" w:hAnsi="Times New Roman" w:cs="Times New Roman"/>
-        </w:rPr>
-        <w:t>crear</w:t>
-      </w:r>
-      <w:r>
-        <w:rPr>
-          <w:rFonts w:ascii="Times New Roman" w:hAnsi="Times New Roman" w:cs="Times New Roman"/>
-        </w:rPr>
-        <w:t xml:space="preserve"> </w:t>
-      </w:r>
-      <w:r>
-        <w:rPr>
-          <w:rFonts w:ascii="Times New Roman" w:hAnsi="Times New Roman" w:cs="Times New Roman"/>
-        </w:rPr>
-        <w:t>una</w:t>
-      </w:r>
-      <w:r>
-        <w:rPr>
-          <w:rFonts w:ascii="Times New Roman" w:hAnsi="Times New Roman" w:cs="Times New Roman"/>
-        </w:rPr>
-        <w:t xml:space="preserve"> </w:t>
-      </w:r>
-      <w:r>
-        <w:rPr>
-          <w:rFonts w:ascii="Times New Roman" w:hAnsi="Times New Roman" w:cs="Times New Roman"/>
-        </w:rPr>
-        <w:t>cuenta</w:t>
-      </w:r>
-      <w:r>
-        <w:rPr>
-          <w:rFonts w:ascii="Times New Roman" w:hAnsi="Times New Roman" w:cs="Times New Roman"/>
-        </w:rPr>
-        <w:t xml:space="preserve"> </w:t>
-      </w:r>
-      <w:r>
-        <w:rPr>
-          <w:rFonts w:ascii="Times New Roman" w:hAnsi="Times New Roman" w:cs="Times New Roman"/>
-        </w:rPr>
-        <w:t>nueva,</w:t>
-      </w:r>
-      <w:r>
-        <w:rPr>
-          <w:rFonts w:ascii="Times New Roman" w:hAnsi="Times New Roman" w:cs="Times New Roman"/>
-        </w:rPr>
-        <w:t xml:space="preserve"> </w:t>
-      </w:r>
-      <w:r>
-        <w:rPr>
-          <w:rFonts w:ascii="Times New Roman" w:hAnsi="Times New Roman" w:cs="Times New Roman"/>
-        </w:rPr>
-        <w:t>los</w:t>
-      </w:r>
-      <w:r>
-        <w:rPr>
-          <w:rFonts w:ascii="Times New Roman" w:hAnsi="Times New Roman" w:cs="Times New Roman"/>
-        </w:rPr>
-        <w:t xml:space="preserve"> </w:t>
-      </w:r>
-      <w:r>
-        <w:rPr>
-          <w:rFonts w:ascii="Times New Roman" w:hAnsi="Times New Roman" w:cs="Times New Roman"/>
+        <w:t xml:space="preserve"> </w:t>
+      </w:r>
+      <w:r>
+        <w:rPr>
+          <w:rFonts w:ascii="Times New Roman" w:hAnsi="Times New Roman" w:cs="Times New Roman"/>
+          <w:b/>
+          <w:bCs/>
         </w:rPr>
         <w:t>datos</w:t>
       </w:r>
       <w:r>
         <w:rPr>
           <w:rFonts w:ascii="Times New Roman" w:hAnsi="Times New Roman" w:cs="Times New Roman"/>
-        </w:rPr>
-        <w:t xml:space="preserve"> </w:t>
-      </w:r>
-      <w:r>
-        <w:rPr>
-          <w:rFonts w:ascii="Times New Roman" w:hAnsi="Times New Roman" w:cs="Times New Roman"/>
-        </w:rPr>
-        <w:t>obligatorios,</w:t>
-      </w:r>
-      <w:r>
-        <w:rPr>
-          <w:rFonts w:ascii="Times New Roman" w:hAnsi="Times New Roman" w:cs="Times New Roman"/>
-        </w:rPr>
-        <w:t xml:space="preserve"> </w:t>
-      </w:r>
-      <w:r>
-        <w:rPr>
-          <w:rFonts w:ascii="Times New Roman" w:hAnsi="Times New Roman" w:cs="Times New Roman"/>
-        </w:rPr>
-        <w:t>y</w:t>
-      </w:r>
-      <w:r>
-        <w:rPr>
-          <w:rFonts w:ascii="Times New Roman" w:hAnsi="Times New Roman" w:cs="Times New Roman"/>
-        </w:rPr>
-        <w:t xml:space="preserve"> </w:t>
-      </w:r>
-      <w:r>
-        <w:rPr>
-          <w:rFonts w:ascii="Times New Roman" w:hAnsi="Times New Roman" w:cs="Times New Roman"/>
-        </w:rPr>
-        <w:t>cómo</w:t>
-      </w:r>
-      <w:r>
-        <w:rPr>
-          <w:rFonts w:ascii="Times New Roman" w:hAnsi="Times New Roman" w:cs="Times New Roman"/>
-        </w:rPr>
-        <w:t xml:space="preserve"> </w:t>
-      </w:r>
-      <w:r>
-        <w:rPr>
-          <w:rFonts w:ascii="Times New Roman" w:hAnsi="Times New Roman" w:cs="Times New Roman"/>
-        </w:rPr>
-        <w:t>iniciar</w:t>
-      </w:r>
-      <w:r>
-        <w:rPr>
-          <w:rFonts w:ascii="Times New Roman" w:hAnsi="Times New Roman" w:cs="Times New Roman"/>
-        </w:rPr>
-        <w:t xml:space="preserve"> </w:t>
-      </w:r>
-      <w:r>
-        <w:rPr>
-          <w:rFonts w:ascii="Times New Roman" w:hAnsi="Times New Roman" w:cs="Times New Roman"/>
-        </w:rPr>
-        <w:t>sesión</w:t>
+          <w:b/>
+          <w:bCs/>
+        </w:rPr>
+        <w:t xml:space="preserve"> </w:t>
+      </w:r>
+      <w:r>
+        <w:rPr>
+          <w:rFonts w:ascii="Times New Roman" w:hAnsi="Times New Roman" w:cs="Times New Roman"/>
+          <w:b/>
+          <w:bCs/>
+        </w:rPr>
+        <w:t>del</w:t>
+      </w:r>
+      <w:r>
+        <w:rPr>
+          <w:rFonts w:ascii="Times New Roman" w:hAnsi="Times New Roman" w:cs="Times New Roman"/>
+          <w:b/>
+          <w:bCs/>
+        </w:rPr>
+        <w:t xml:space="preserve"> </w:t>
+      </w:r>
+      <w:r>
+        <w:rPr>
+          <w:rFonts w:ascii="Times New Roman" w:hAnsi="Times New Roman" w:cs="Times New Roman"/>
+          <w:b/>
+          <w:bCs/>
+        </w:rPr>
+        <w:t>perfil</w:t>
+      </w:r>
+      <w:r>
+        <w:rPr>
+          <w:rFonts w:ascii="Times New Roman" w:hAnsi="Times New Roman" w:cs="Times New Roman"/>
+        </w:rPr>
+        <w:t xml:space="preserve"> </w:t>
+      </w:r>
+      <w:r>
+        <w:rPr>
+          <w:rFonts w:ascii="Times New Roman" w:hAnsi="Times New Roman" w:cs="Times New Roman"/>
+        </w:rPr>
+        <w:t>(nombre,</w:t>
+      </w:r>
+      <w:r>
+        <w:rPr>
+          <w:rFonts w:ascii="Times New Roman" w:hAnsi="Times New Roman" w:cs="Times New Roman"/>
+        </w:rPr>
+        <w:t xml:space="preserve"> </w:t>
+      </w:r>
+      <w:r>
+        <w:rPr>
+          <w:rFonts w:ascii="Times New Roman" w:hAnsi="Times New Roman" w:cs="Times New Roman"/>
+        </w:rPr>
+        <w:t>correo,</w:t>
+      </w:r>
+      <w:r>
+        <w:rPr>
+          <w:rFonts w:ascii="Times New Roman" w:hAnsi="Times New Roman" w:cs="Times New Roman"/>
+        </w:rPr>
+        <w:t xml:space="preserve"> </w:t>
+      </w:r>
+      <w:r>
+        <w:rPr>
+          <w:rFonts w:ascii="Times New Roman" w:hAnsi="Times New Roman" w:cs="Times New Roman"/>
+        </w:rPr>
+        <w:t>ciudad,</w:t>
+      </w:r>
+      <w:r>
+        <w:rPr>
+          <w:rFonts w:ascii="Times New Roman" w:hAnsi="Times New Roman" w:cs="Times New Roman"/>
+        </w:rPr>
+        <w:t xml:space="preserve"> </w:t>
+      </w:r>
+      <w:r>
+        <w:rPr>
+          <w:rFonts w:ascii="Times New Roman" w:hAnsi="Times New Roman" w:cs="Times New Roman"/>
+        </w:rPr>
+        <w:t>foto),</w:t>
+      </w:r>
+      <w:r>
+        <w:rPr>
+          <w:rFonts w:ascii="Times New Roman" w:hAnsi="Times New Roman" w:cs="Times New Roman"/>
+        </w:rPr>
+        <w:t xml:space="preserve"> </w:t>
+      </w:r>
+      <w:r>
+        <w:rPr>
+          <w:rFonts w:ascii="Times New Roman" w:hAnsi="Times New Roman" w:cs="Times New Roman"/>
+        </w:rPr>
+        <w:t>función</w:t>
+      </w:r>
+      <w:r>
+        <w:rPr>
+          <w:rFonts w:ascii="Times New Roman" w:hAnsi="Times New Roman" w:cs="Times New Roman"/>
+        </w:rPr>
+        <w:t xml:space="preserve"> </w:t>
+      </w:r>
+      <w:r>
+        <w:rPr>
+          <w:rFonts w:ascii="Times New Roman" w:hAnsi="Times New Roman" w:cs="Times New Roman"/>
+        </w:rPr>
+        <w:t>que</w:t>
+      </w:r>
+      <w:r>
+        <w:rPr>
+          <w:rFonts w:ascii="Times New Roman" w:hAnsi="Times New Roman" w:cs="Times New Roman"/>
+        </w:rPr>
+        <w:t xml:space="preserve"> </w:t>
+      </w:r>
+      <w:r>
+        <w:rPr>
+          <w:rFonts w:ascii="Times New Roman" w:hAnsi="Times New Roman" w:cs="Times New Roman"/>
+        </w:rPr>
+        <w:t>fue</w:t>
+      </w:r>
+      <w:r>
+        <w:rPr>
+          <w:rFonts w:ascii="Times New Roman" w:hAnsi="Times New Roman" w:cs="Times New Roman"/>
+        </w:rPr>
+        <w:t xml:space="preserve"> </w:t>
+      </w:r>
+      <w:r>
+        <w:rPr>
+          <w:rFonts w:ascii="Times New Roman" w:hAnsi="Times New Roman" w:cs="Times New Roman"/>
+        </w:rPr>
+        <w:t>conectada</w:t>
+      </w:r>
+      <w:r>
+        <w:rPr>
+          <w:rFonts w:ascii="Times New Roman" w:hAnsi="Times New Roman" w:cs="Times New Roman"/>
+        </w:rPr>
+        <w:t xml:space="preserve"> </w:t>
+      </w:r>
+      <w:r>
+        <w:rPr>
+          <w:rFonts w:ascii="Times New Roman" w:hAnsi="Times New Roman" w:cs="Times New Roman"/>
+        </w:rPr>
+        <w:t>completamente</w:t>
+      </w:r>
+      <w:r>
+        <w:rPr>
+          <w:rFonts w:ascii="Times New Roman" w:hAnsi="Times New Roman" w:cs="Times New Roman"/>
+        </w:rPr>
+        <w:t xml:space="preserve"> </w:t>
+      </w:r>
+      <w:r>
+        <w:rPr>
+          <w:rFonts w:ascii="Times New Roman" w:hAnsi="Times New Roman" w:cs="Times New Roman"/>
+        </w:rPr>
+        <w:t>a</w:t>
+      </w:r>
+      <w:r>
+        <w:rPr>
+          <w:rFonts w:ascii="Times New Roman" w:hAnsi="Times New Roman" w:cs="Times New Roman"/>
+        </w:rPr>
+        <w:t xml:space="preserve"> </w:t>
+      </w:r>
+      <w:r>
+        <w:rPr>
+          <w:rFonts w:ascii="Times New Roman" w:hAnsi="Times New Roman" w:cs="Times New Roman"/>
+        </w:rPr>
+        <w:t>la</w:t>
+      </w:r>
+      <w:r>
+        <w:rPr>
+          <w:rFonts w:ascii="Times New Roman" w:hAnsi="Times New Roman" w:cs="Times New Roman"/>
+        </w:rPr>
+        <w:t xml:space="preserve"> </w:t>
+      </w:r>
+      <w:r>
+        <w:rPr>
+          <w:rFonts w:ascii="Times New Roman" w:hAnsi="Times New Roman" w:cs="Times New Roman"/>
+        </w:rPr>
+        <w:t>base</w:t>
       </w:r>
       <w:r>
         <w:rPr>
@@ -6758,19 +6495,43 @@
         <w:rPr>
           <w:rFonts w:ascii="Times New Roman" w:hAnsi="Times New Roman" w:cs="Times New Roman"/>
         </w:rPr>
-        <w:t>forma</w:t>
-      </w:r>
-      <w:r>
-        <w:rPr>
-          <w:rFonts w:ascii="Times New Roman" w:hAnsi="Times New Roman" w:cs="Times New Roman"/>
-        </w:rPr>
-        <w:t xml:space="preserve"> </w:t>
-      </w:r>
-      <w:r>
-        <w:rPr>
-          <w:rFonts w:ascii="Times New Roman" w:hAnsi="Times New Roman" w:cs="Times New Roman"/>
-        </w:rPr>
-        <w:t>segura.</w:t>
+        <w:t>datos</w:t>
+      </w:r>
+      <w:r>
+        <w:rPr>
+          <w:rFonts w:ascii="Times New Roman" w:hAnsi="Times New Roman" w:cs="Times New Roman"/>
+        </w:rPr>
+        <w:t xml:space="preserve"> </w:t>
+      </w:r>
+      <w:r>
+        <w:rPr>
+          <w:rFonts w:ascii="Times New Roman" w:hAnsi="Times New Roman" w:cs="Times New Roman"/>
+        </w:rPr>
+        <w:t>durante</w:t>
+      </w:r>
+      <w:r>
+        <w:rPr>
+          <w:rFonts w:ascii="Times New Roman" w:hAnsi="Times New Roman" w:cs="Times New Roman"/>
+        </w:rPr>
+        <w:t xml:space="preserve"> </w:t>
+      </w:r>
+      <w:r>
+        <w:rPr>
+          <w:rFonts w:ascii="Times New Roman" w:hAnsi="Times New Roman" w:cs="Times New Roman"/>
+        </w:rPr>
+        <w:t>el</w:t>
+      </w:r>
+      <w:r>
+        <w:rPr>
+          <w:rFonts w:ascii="Times New Roman" w:hAnsi="Times New Roman" w:cs="Times New Roman"/>
+        </w:rPr>
+        <w:t xml:space="preserve"> </w:t>
+      </w:r>
+      <w:r>
+        <w:rPr>
+          <w:rFonts w:ascii="Times New Roman" w:hAnsi="Times New Roman" w:cs="Times New Roman"/>
+        </w:rPr>
+        <w:t>desarrollo.</w:t>
       </w:r>
     </w:p>
     <w:p>
@@ -6790,7 +6551,7 @@
           <w:b/>
           <w:bCs/>
         </w:rPr>
-        <w:t>Gestión</w:t>
+        <w:t>Publicación,</w:t>
       </w:r>
       <w:r>
         <w:rPr>
@@ -6806,7 +6567,7 @@
           <w:b/>
           <w:bCs/>
         </w:rPr>
-        <w:t>del</w:t>
+        <w:t>consulta</w:t>
       </w:r>
       <w:r>
         <w:rPr>
@@ -6822,49 +6583,7 @@
           <w:b/>
           <w:bCs/>
         </w:rPr>
-        <w:t>perfil.</w:t>
-      </w:r>
-      <w:r>
-        <w:rPr>
-          <w:rFonts w:ascii="Times New Roman" w:hAnsi="Times New Roman" w:cs="Times New Roman"/>
-        </w:rPr>
-        <w:t xml:space="preserve"> </w:t>
-      </w:r>
-      <w:r>
-        <w:rPr>
-          <w:rFonts w:ascii="Times New Roman" w:hAnsi="Times New Roman" w:cs="Times New Roman"/>
-        </w:rPr>
-        <w:t>Cómo</w:t>
-      </w:r>
-      <w:r>
-        <w:rPr>
-          <w:rFonts w:ascii="Times New Roman" w:hAnsi="Times New Roman" w:cs="Times New Roman"/>
-        </w:rPr>
-        <w:t xml:space="preserve"> </w:t>
-      </w:r>
-      <w:r>
-        <w:rPr>
-          <w:rFonts w:ascii="Times New Roman" w:hAnsi="Times New Roman" w:cs="Times New Roman"/>
-        </w:rPr>
-        <w:t>consultar</w:t>
-      </w:r>
-      <w:r>
-        <w:rPr>
-          <w:rFonts w:ascii="Times New Roman" w:hAnsi="Times New Roman" w:cs="Times New Roman"/>
-        </w:rPr>
-        <w:t xml:space="preserve"> </w:t>
-      </w:r>
-      <w:r>
-        <w:rPr>
-          <w:rFonts w:ascii="Times New Roman" w:hAnsi="Times New Roman" w:cs="Times New Roman"/>
-        </w:rPr>
         <w:t>y</w:t>
-      </w:r>
-      <w:r>
-        <w:rPr>
-          <w:rFonts w:ascii="Times New Roman" w:hAnsi="Times New Roman" w:cs="Times New Roman"/>
-        </w:rPr>
-        <w:t xml:space="preserve"> </w:t>
       </w:r>
       <w:r>
         <w:rPr>
@@ -6872,7 +6591,7 @@
           <w:b/>
           <w:bCs/>
         </w:rPr>
-        <w:t>editar</w:t>
+        <w:t xml:space="preserve"> </w:t>
       </w:r>
       <w:r>
         <w:rPr>
@@ -6880,7 +6599,7 @@
           <w:b/>
           <w:bCs/>
         </w:rPr>
-        <w:t xml:space="preserve"> </w:t>
+        <w:t>actualización</w:t>
       </w:r>
       <w:r>
         <w:rPr>
@@ -6888,7 +6607,7 @@
           <w:b/>
           <w:bCs/>
         </w:rPr>
-        <w:t>los</w:t>
+        <w:t xml:space="preserve"> </w:t>
       </w:r>
       <w:r>
         <w:rPr>
@@ -6896,7 +6615,7 @@
           <w:b/>
           <w:bCs/>
         </w:rPr>
-        <w:t xml:space="preserve"> </w:t>
+        <w:t>de</w:t>
       </w:r>
       <w:r>
         <w:rPr>
@@ -6904,7 +6623,7 @@
           <w:b/>
           <w:bCs/>
         </w:rPr>
-        <w:t>datos</w:t>
+        <w:t xml:space="preserve"> </w:t>
       </w:r>
       <w:r>
         <w:rPr>
@@ -6912,6 +6631,216 @@
           <w:b/>
           <w:bCs/>
         </w:rPr>
+        <w:t>ofertas.</w:t>
+      </w:r>
+      <w:r>
+        <w:rPr>
+          <w:rFonts w:ascii="Times New Roman" w:hAnsi="Times New Roman" w:cs="Times New Roman"/>
+        </w:rPr>
+        <w:t xml:space="preserve"> </w:t>
+      </w:r>
+      <w:r>
+        <w:rPr>
+          <w:rFonts w:ascii="Times New Roman" w:hAnsi="Times New Roman" w:cs="Times New Roman"/>
+        </w:rPr>
+        <w:t>Cómo</w:t>
+      </w:r>
+      <w:r>
+        <w:rPr>
+          <w:rFonts w:ascii="Times New Roman" w:hAnsi="Times New Roman" w:cs="Times New Roman"/>
+        </w:rPr>
+        <w:t xml:space="preserve"> </w:t>
+      </w:r>
+      <w:r>
+        <w:rPr>
+          <w:rFonts w:ascii="Times New Roman" w:hAnsi="Times New Roman" w:cs="Times New Roman"/>
+        </w:rPr>
+        <w:t>publicar</w:t>
+      </w:r>
+      <w:r>
+        <w:rPr>
+          <w:rFonts w:ascii="Times New Roman" w:hAnsi="Times New Roman" w:cs="Times New Roman"/>
+        </w:rPr>
+        <w:t xml:space="preserve"> </w:t>
+      </w:r>
+      <w:r>
+        <w:rPr>
+          <w:rFonts w:ascii="Times New Roman" w:hAnsi="Times New Roman" w:cs="Times New Roman"/>
+        </w:rPr>
+        <w:t>una</w:t>
+      </w:r>
+      <w:r>
+        <w:rPr>
+          <w:rFonts w:ascii="Times New Roman" w:hAnsi="Times New Roman" w:cs="Times New Roman"/>
+        </w:rPr>
+        <w:t xml:space="preserve"> </w:t>
+      </w:r>
+      <w:r>
+        <w:rPr>
+          <w:rFonts w:ascii="Times New Roman" w:hAnsi="Times New Roman" w:cs="Times New Roman"/>
+        </w:rPr>
+        <w:t>oferta</w:t>
+      </w:r>
+      <w:r>
+        <w:rPr>
+          <w:rFonts w:ascii="Times New Roman" w:hAnsi="Times New Roman" w:cs="Times New Roman"/>
+        </w:rPr>
+        <w:t xml:space="preserve"> </w:t>
+      </w:r>
+      <w:r>
+        <w:rPr>
+          <w:rFonts w:ascii="Times New Roman" w:hAnsi="Times New Roman" w:cs="Times New Roman"/>
+        </w:rPr>
+        <w:t>nueva,</w:t>
+      </w:r>
+      <w:r>
+        <w:rPr>
+          <w:rFonts w:ascii="Times New Roman" w:hAnsi="Times New Roman" w:cs="Times New Roman"/>
+        </w:rPr>
+        <w:t xml:space="preserve"> </w:t>
+      </w:r>
+      <w:r>
+        <w:rPr>
+          <w:rFonts w:ascii="Times New Roman" w:hAnsi="Times New Roman" w:cs="Times New Roman"/>
+        </w:rPr>
+        <w:t>explorar</w:t>
+      </w:r>
+      <w:r>
+        <w:rPr>
+          <w:rFonts w:ascii="Times New Roman" w:hAnsi="Times New Roman" w:cs="Times New Roman"/>
+        </w:rPr>
+        <w:t xml:space="preserve"> </w:t>
+      </w:r>
+      <w:r>
+        <w:rPr>
+          <w:rFonts w:ascii="Times New Roman" w:hAnsi="Times New Roman" w:cs="Times New Roman"/>
+        </w:rPr>
+        <w:t>las</w:t>
+      </w:r>
+      <w:r>
+        <w:rPr>
+          <w:rFonts w:ascii="Times New Roman" w:hAnsi="Times New Roman" w:cs="Times New Roman"/>
+        </w:rPr>
+        <w:t xml:space="preserve"> </w:t>
+      </w:r>
+      <w:r>
+        <w:rPr>
+          <w:rFonts w:ascii="Times New Roman" w:hAnsi="Times New Roman" w:cs="Times New Roman"/>
+        </w:rPr>
+        <w:t>ofertas</w:t>
+      </w:r>
+      <w:r>
+        <w:rPr>
+          <w:rFonts w:ascii="Times New Roman" w:hAnsi="Times New Roman" w:cs="Times New Roman"/>
+        </w:rPr>
+        <w:t xml:space="preserve"> </w:t>
+      </w:r>
+      <w:r>
+        <w:rPr>
+          <w:rFonts w:ascii="Times New Roman" w:hAnsi="Times New Roman" w:cs="Times New Roman"/>
+        </w:rPr>
+        <w:t>de</w:t>
+      </w:r>
+      <w:r>
+        <w:rPr>
+          <w:rFonts w:ascii="Times New Roman" w:hAnsi="Times New Roman" w:cs="Times New Roman"/>
+        </w:rPr>
+        <w:t xml:space="preserve"> </w:t>
+      </w:r>
+      <w:r>
+        <w:rPr>
+          <w:rFonts w:ascii="Times New Roman" w:hAnsi="Times New Roman" w:cs="Times New Roman"/>
+        </w:rPr>
+        <w:t>otros</w:t>
+      </w:r>
+      <w:r>
+        <w:rPr>
+          <w:rFonts w:ascii="Times New Roman" w:hAnsi="Times New Roman" w:cs="Times New Roman"/>
+        </w:rPr>
+        <w:t xml:space="preserve"> </w:t>
+      </w:r>
+      <w:r>
+        <w:rPr>
+          <w:rFonts w:ascii="Times New Roman" w:hAnsi="Times New Roman" w:cs="Times New Roman"/>
+        </w:rPr>
+        <w:t>usuarios</w:t>
+      </w:r>
+      <w:r>
+        <w:rPr>
+          <w:rFonts w:ascii="Times New Roman" w:hAnsi="Times New Roman" w:cs="Times New Roman"/>
+        </w:rPr>
+        <w:t xml:space="preserve"> </w:t>
+      </w:r>
+      <w:r>
+        <w:rPr>
+          <w:rFonts w:ascii="Times New Roman" w:hAnsi="Times New Roman" w:cs="Times New Roman"/>
+        </w:rPr>
+        <w:t>con</w:t>
+      </w:r>
+      <w:r>
+        <w:rPr>
+          <w:rFonts w:ascii="Times New Roman" w:hAnsi="Times New Roman" w:cs="Times New Roman"/>
+        </w:rPr>
+        <w:t xml:space="preserve"> </w:t>
+      </w:r>
+      <w:r>
+        <w:rPr>
+          <w:rFonts w:ascii="Times New Roman" w:hAnsi="Times New Roman" w:cs="Times New Roman"/>
+        </w:rPr>
+        <w:t>los</w:t>
+      </w:r>
+      <w:r>
+        <w:rPr>
+          <w:rFonts w:ascii="Times New Roman" w:hAnsi="Times New Roman" w:cs="Times New Roman"/>
+        </w:rPr>
+        <w:t xml:space="preserve"> </w:t>
+      </w:r>
+      <w:r>
+        <w:rPr>
+          <w:rFonts w:ascii="Times New Roman" w:hAnsi="Times New Roman" w:cs="Times New Roman"/>
+        </w:rPr>
+        <w:t>filtros</w:t>
+      </w:r>
+      <w:r>
+        <w:rPr>
+          <w:rFonts w:ascii="Times New Roman" w:hAnsi="Times New Roman" w:cs="Times New Roman"/>
+        </w:rPr>
+        <w:t xml:space="preserve"> </w:t>
+      </w:r>
+      <w:r>
+        <w:rPr>
+          <w:rFonts w:ascii="Times New Roman" w:hAnsi="Times New Roman" w:cs="Times New Roman"/>
+        </w:rPr>
+        <w:t>disponibles,</w:t>
+      </w:r>
+      <w:r>
+        <w:rPr>
+          <w:rFonts w:ascii="Times New Roman" w:hAnsi="Times New Roman" w:cs="Times New Roman"/>
+        </w:rPr>
+        <w:t xml:space="preserve"> </w:t>
+      </w:r>
+      <w:r>
+        <w:rPr>
+          <w:rFonts w:ascii="Times New Roman" w:hAnsi="Times New Roman" w:cs="Times New Roman"/>
+        </w:rPr>
+        <w:t>y</w:t>
+      </w:r>
+      <w:r>
+        <w:rPr>
+          <w:rFonts w:ascii="Times New Roman" w:hAnsi="Times New Roman" w:cs="Times New Roman"/>
+        </w:rPr>
+        <w:t xml:space="preserve"> </w:t>
+      </w:r>
+      <w:r>
+        <w:rPr>
+          <w:rFonts w:ascii="Times New Roman" w:hAnsi="Times New Roman" w:cs="Times New Roman"/>
+        </w:rPr>
+        <w:t>cómo</w:t>
+      </w:r>
+      <w:r>
+        <w:rPr>
+          <w:rFonts w:ascii="Times New Roman" w:hAnsi="Times New Roman" w:cs="Times New Roman"/>
+        </w:rPr>
         <w:t xml:space="preserve"> </w:t>
       </w:r>
       <w:r>
@@ -6920,7 +6849,7 @@
           <w:b/>
           <w:bCs/>
         </w:rPr>
-        <w:t>del</w:t>
+        <w:t>editar</w:t>
       </w:r>
       <w:r>
         <w:rPr>
@@ -6936,211 +6865,83 @@
           <w:b/>
           <w:bCs/>
         </w:rPr>
-        <w:t>perfil</w:t>
-      </w:r>
-      <w:r>
-        <w:rPr>
-          <w:rFonts w:ascii="Times New Roman" w:hAnsi="Times New Roman" w:cs="Times New Roman"/>
-        </w:rPr>
-        <w:t xml:space="preserve"> </w:t>
-      </w:r>
-      <w:r>
-        <w:rPr>
-          <w:rFonts w:ascii="Times New Roman" w:hAnsi="Times New Roman" w:cs="Times New Roman"/>
-        </w:rPr>
-        <w:t>(nombre,</w:t>
-      </w:r>
-      <w:r>
-        <w:rPr>
-          <w:rFonts w:ascii="Times New Roman" w:hAnsi="Times New Roman" w:cs="Times New Roman"/>
-        </w:rPr>
-        <w:t xml:space="preserve"> </w:t>
-      </w:r>
-      <w:r>
-        <w:rPr>
-          <w:rFonts w:ascii="Times New Roman" w:hAnsi="Times New Roman" w:cs="Times New Roman"/>
-        </w:rPr>
-        <w:t>correo,</w:t>
-      </w:r>
-      <w:r>
-        <w:rPr>
-          <w:rFonts w:ascii="Times New Roman" w:hAnsi="Times New Roman" w:cs="Times New Roman"/>
-        </w:rPr>
-        <w:t xml:space="preserve"> </w:t>
-      </w:r>
-      <w:r>
-        <w:rPr>
-          <w:rFonts w:ascii="Times New Roman" w:hAnsi="Times New Roman" w:cs="Times New Roman"/>
-        </w:rPr>
-        <w:t>ciudad,</w:t>
-      </w:r>
-      <w:r>
-        <w:rPr>
-          <w:rFonts w:ascii="Times New Roman" w:hAnsi="Times New Roman" w:cs="Times New Roman"/>
-        </w:rPr>
-        <w:t xml:space="preserve"> </w:t>
-      </w:r>
-      <w:r>
-        <w:rPr>
-          <w:rFonts w:ascii="Times New Roman" w:hAnsi="Times New Roman" w:cs="Times New Roman"/>
-        </w:rPr>
-        <w:t>foto),</w:t>
-      </w:r>
-      <w:r>
-        <w:rPr>
-          <w:rFonts w:ascii="Times New Roman" w:hAnsi="Times New Roman" w:cs="Times New Roman"/>
-        </w:rPr>
-        <w:t xml:space="preserve"> </w:t>
-      </w:r>
-      <w:r>
-        <w:rPr>
-          <w:rFonts w:ascii="Times New Roman" w:hAnsi="Times New Roman" w:cs="Times New Roman"/>
-        </w:rPr>
-        <w:t>función</w:t>
-      </w:r>
-      <w:r>
-        <w:rPr>
-          <w:rFonts w:ascii="Times New Roman" w:hAnsi="Times New Roman" w:cs="Times New Roman"/>
-        </w:rPr>
-        <w:t xml:space="preserve"> </w:t>
-      </w:r>
-      <w:r>
-        <w:rPr>
-          <w:rFonts w:ascii="Times New Roman" w:hAnsi="Times New Roman" w:cs="Times New Roman"/>
-        </w:rPr>
-        <w:t>que</w:t>
-      </w:r>
-      <w:r>
-        <w:rPr>
-          <w:rFonts w:ascii="Times New Roman" w:hAnsi="Times New Roman" w:cs="Times New Roman"/>
-        </w:rPr>
-        <w:t xml:space="preserve"> </w:t>
-      </w:r>
-      <w:r>
-        <w:rPr>
-          <w:rFonts w:ascii="Times New Roman" w:hAnsi="Times New Roman" w:cs="Times New Roman"/>
-        </w:rPr>
-        <w:t>fue</w:t>
-      </w:r>
-      <w:r>
-        <w:rPr>
-          <w:rFonts w:ascii="Times New Roman" w:hAnsi="Times New Roman" w:cs="Times New Roman"/>
-        </w:rPr>
-        <w:t xml:space="preserve"> </w:t>
-      </w:r>
-      <w:r>
-        <w:rPr>
-          <w:rFonts w:ascii="Times New Roman" w:hAnsi="Times New Roman" w:cs="Times New Roman"/>
-        </w:rPr>
-        <w:t>conectada</w:t>
-      </w:r>
-      <w:r>
-        <w:rPr>
-          <w:rFonts w:ascii="Times New Roman" w:hAnsi="Times New Roman" w:cs="Times New Roman"/>
-        </w:rPr>
-        <w:t xml:space="preserve"> </w:t>
-      </w:r>
-      <w:r>
-        <w:rPr>
-          <w:rFonts w:ascii="Times New Roman" w:hAnsi="Times New Roman" w:cs="Times New Roman"/>
-        </w:rPr>
-        <w:t>completamente</w:t>
-      </w:r>
-      <w:r>
-        <w:rPr>
-          <w:rFonts w:ascii="Times New Roman" w:hAnsi="Times New Roman" w:cs="Times New Roman"/>
-        </w:rPr>
-        <w:t xml:space="preserve"> </w:t>
-      </w:r>
-      <w:r>
-        <w:rPr>
-          <w:rFonts w:ascii="Times New Roman" w:hAnsi="Times New Roman" w:cs="Times New Roman"/>
-        </w:rPr>
-        <w:t>a</w:t>
-      </w:r>
-      <w:r>
-        <w:rPr>
-          <w:rFonts w:ascii="Times New Roman" w:hAnsi="Times New Roman" w:cs="Times New Roman"/>
-        </w:rPr>
-        <w:t xml:space="preserve"> </w:t>
-      </w:r>
-      <w:r>
-        <w:rPr>
-          <w:rFonts w:ascii="Times New Roman" w:hAnsi="Times New Roman" w:cs="Times New Roman"/>
-        </w:rPr>
-        <w:t>la</w:t>
-      </w:r>
-      <w:r>
-        <w:rPr>
-          <w:rFonts w:ascii="Times New Roman" w:hAnsi="Times New Roman" w:cs="Times New Roman"/>
-        </w:rPr>
-        <w:t xml:space="preserve"> </w:t>
-      </w:r>
-      <w:r>
-        <w:rPr>
-          <w:rFonts w:ascii="Times New Roman" w:hAnsi="Times New Roman" w:cs="Times New Roman"/>
-        </w:rPr>
-        <w:t>base</w:t>
-      </w:r>
-      <w:r>
-        <w:rPr>
-          <w:rFonts w:ascii="Times New Roman" w:hAnsi="Times New Roman" w:cs="Times New Roman"/>
-        </w:rPr>
-        <w:t xml:space="preserve"> </w:t>
-      </w:r>
-      <w:r>
-        <w:rPr>
-          <w:rFonts w:ascii="Times New Roman" w:hAnsi="Times New Roman" w:cs="Times New Roman"/>
-        </w:rPr>
-        <w:t>de</w:t>
-      </w:r>
-      <w:r>
-        <w:rPr>
-          <w:rFonts w:ascii="Times New Roman" w:hAnsi="Times New Roman" w:cs="Times New Roman"/>
-        </w:rPr>
-        <w:t xml:space="preserve"> </w:t>
-      </w:r>
-      <w:r>
-        <w:rPr>
-          <w:rFonts w:ascii="Times New Roman" w:hAnsi="Times New Roman" w:cs="Times New Roman"/>
-        </w:rPr>
-        <w:t>datos</w:t>
-      </w:r>
-      <w:r>
-        <w:rPr>
-          <w:rFonts w:ascii="Times New Roman" w:hAnsi="Times New Roman" w:cs="Times New Roman"/>
-        </w:rPr>
-        <w:t xml:space="preserve"> </w:t>
-      </w:r>
-      <w:r>
-        <w:rPr>
-          <w:rFonts w:ascii="Times New Roman" w:hAnsi="Times New Roman" w:cs="Times New Roman"/>
-        </w:rPr>
-        <w:t>durante</w:t>
-      </w:r>
-      <w:r>
-        <w:rPr>
-          <w:rFonts w:ascii="Times New Roman" w:hAnsi="Times New Roman" w:cs="Times New Roman"/>
-        </w:rPr>
-        <w:t xml:space="preserve"> </w:t>
-      </w:r>
-      <w:r>
-        <w:rPr>
-          <w:rFonts w:ascii="Times New Roman" w:hAnsi="Times New Roman" w:cs="Times New Roman"/>
-        </w:rPr>
-        <w:t>el</w:t>
-      </w:r>
-      <w:r>
-        <w:rPr>
-          <w:rFonts w:ascii="Times New Roman" w:hAnsi="Times New Roman" w:cs="Times New Roman"/>
-        </w:rPr>
-        <w:t xml:space="preserve"> </w:t>
-      </w:r>
-      <w:r>
-        <w:rPr>
-          <w:rFonts w:ascii="Times New Roman" w:hAnsi="Times New Roman" w:cs="Times New Roman"/>
-        </w:rPr>
-        <w:t>desarrollo.</w:t>
+        <w:t>o</w:t>
+      </w:r>
+      <w:r>
+        <w:rPr>
+          <w:rFonts w:ascii="Times New Roman" w:hAnsi="Times New Roman" w:cs="Times New Roman"/>
+          <w:b/>
+          <w:bCs/>
+        </w:rPr>
+        <w:t xml:space="preserve"> </w:t>
+      </w:r>
+      <w:r>
+        <w:rPr>
+          <w:rFonts w:ascii="Times New Roman" w:hAnsi="Times New Roman" w:cs="Times New Roman"/>
+          <w:b/>
+          <w:bCs/>
+        </w:rPr>
+        <w:t>eliminar</w:t>
+      </w:r>
+      <w:r>
+        <w:rPr>
+          <w:rFonts w:ascii="Times New Roman" w:hAnsi="Times New Roman" w:cs="Times New Roman"/>
+        </w:rPr>
+        <w:t xml:space="preserve"> </w:t>
+      </w:r>
+      <w:r>
+        <w:rPr>
+          <w:rFonts w:ascii="Times New Roman" w:hAnsi="Times New Roman" w:cs="Times New Roman"/>
+        </w:rPr>
+        <w:t>una</w:t>
+      </w:r>
+      <w:r>
+        <w:rPr>
+          <w:rFonts w:ascii="Times New Roman" w:hAnsi="Times New Roman" w:cs="Times New Roman"/>
+        </w:rPr>
+        <w:t xml:space="preserve"> </w:t>
+      </w:r>
+      <w:r>
+        <w:rPr>
+          <w:rFonts w:ascii="Times New Roman" w:hAnsi="Times New Roman" w:cs="Times New Roman"/>
+        </w:rPr>
+        <w:t>oferta</w:t>
+      </w:r>
+      <w:r>
+        <w:rPr>
+          <w:rFonts w:ascii="Times New Roman" w:hAnsi="Times New Roman" w:cs="Times New Roman"/>
+        </w:rPr>
+        <w:t xml:space="preserve"> </w:t>
+      </w:r>
+      <w:r>
+        <w:rPr>
+          <w:rFonts w:ascii="Times New Roman" w:hAnsi="Times New Roman" w:cs="Times New Roman"/>
+        </w:rPr>
+        <w:t>propia</w:t>
+      </w:r>
+      <w:r>
+        <w:rPr>
+          <w:rFonts w:ascii="Times New Roman" w:hAnsi="Times New Roman" w:cs="Times New Roman"/>
+        </w:rPr>
+        <w:t xml:space="preserve"> </w:t>
+      </w:r>
+      <w:r>
+        <w:rPr>
+          <w:rFonts w:ascii="Times New Roman" w:hAnsi="Times New Roman" w:cs="Times New Roman"/>
+        </w:rPr>
+        <w:t>ya</w:t>
+      </w:r>
+      <w:r>
+        <w:rPr>
+          <w:rFonts w:ascii="Times New Roman" w:hAnsi="Times New Roman" w:cs="Times New Roman"/>
+        </w:rPr>
+        <w:t xml:space="preserve"> </w:t>
+      </w:r>
+      <w:r>
+        <w:rPr>
+          <w:rFonts w:ascii="Times New Roman" w:hAnsi="Times New Roman" w:cs="Times New Roman"/>
+        </w:rPr>
+        <w:t>publicada.</w:t>
       </w:r>
     </w:p>
     <w:p>
@@ -7156,401 +6957,16 @@
       </w:pPr>
       <w:r>
         <w:rPr>
-          <w:rFonts w:ascii="Times New Roman" w:hAnsi="Times New Roman" w:cs="Times New Roman"/>
+          <w:rFonts w:ascii="Times New Roman" w:hAnsi="Times New Roman"/>
           <w:b/>
-          <w:bCs/>
-        </w:rPr>
-        <w:t>Publicación,</w:t>
-      </w:r>
-      <w:r>
-        <w:rPr>
-          <w:rFonts w:ascii="Times New Roman" w:hAnsi="Times New Roman" w:cs="Times New Roman"/>
-          <w:b/>
-          <w:bCs/>
-        </w:rPr>
-        <w:t xml:space="preserve"> </w:t>
-      </w:r>
-      <w:r>
-        <w:rPr>
-          <w:rFonts w:ascii="Times New Roman" w:hAnsi="Times New Roman" w:cs="Times New Roman"/>
-          <w:b/>
-          <w:bCs/>
-        </w:rPr>
-        <w:t>consulta</w:t>
-      </w:r>
-      <w:r>
-        <w:rPr>
-          <w:rFonts w:ascii="Times New Roman" w:hAnsi="Times New Roman" w:cs="Times New Roman"/>
-          <w:b/>
-          <w:bCs/>
-        </w:rPr>
-        <w:t xml:space="preserve"> </w:t>
-      </w:r>
-      <w:r>
-        <w:rPr>
-          <w:rFonts w:ascii="Times New Roman" w:hAnsi="Times New Roman" w:cs="Times New Roman"/>
-          <w:b/>
-          <w:bCs/>
-        </w:rPr>
-        <w:t>y</w:t>
-      </w:r>
-      <w:r>
-        <w:rPr>
-          <w:rFonts w:ascii="Times New Roman" w:hAnsi="Times New Roman" w:cs="Times New Roman"/>
-          <w:b/>
-          <w:bCs/>
-        </w:rPr>
-        <w:t xml:space="preserve"> </w:t>
-      </w:r>
-      <w:r>
-        <w:rPr>
-          <w:rFonts w:ascii="Times New Roman" w:hAnsi="Times New Roman" w:cs="Times New Roman"/>
-          <w:b/>
-          <w:bCs/>
-        </w:rPr>
-        <w:t>actualización</w:t>
-      </w:r>
-      <w:r>
-        <w:rPr>
-          <w:rFonts w:ascii="Times New Roman" w:hAnsi="Times New Roman" w:cs="Times New Roman"/>
-          <w:b/>
-          <w:bCs/>
-        </w:rPr>
-        <w:t xml:space="preserve"> </w:t>
-      </w:r>
-      <w:r>
-        <w:rPr>
-          <w:rFonts w:ascii="Times New Roman" w:hAnsi="Times New Roman" w:cs="Times New Roman"/>
-          <w:b/>
-          <w:bCs/>
-        </w:rPr>
-        <w:t>de</w:t>
-      </w:r>
-      <w:r>
-        <w:rPr>
-          <w:rFonts w:ascii="Times New Roman" w:hAnsi="Times New Roman" w:cs="Times New Roman"/>
-          <w:b/>
-          <w:bCs/>
-        </w:rPr>
-        <w:t xml:space="preserve"> </w:t>
-      </w:r>
-      <w:r>
-        <w:rPr>
-          <w:rFonts w:ascii="Times New Roman" w:hAnsi="Times New Roman" w:cs="Times New Roman"/>
-          <w:b/>
-          <w:bCs/>
-        </w:rPr>
-        <w:t>ofertas.</w:t>
-      </w:r>
-      <w:r>
-        <w:rPr>
-          <w:rFonts w:ascii="Times New Roman" w:hAnsi="Times New Roman" w:cs="Times New Roman"/>
-        </w:rPr>
-        <w:t xml:space="preserve"> </w:t>
-      </w:r>
-      <w:r>
-        <w:rPr>
-          <w:rFonts w:ascii="Times New Roman" w:hAnsi="Times New Roman" w:cs="Times New Roman"/>
-        </w:rPr>
-        <w:t>Cómo</w:t>
-      </w:r>
-      <w:r>
-        <w:rPr>
-          <w:rFonts w:ascii="Times New Roman" w:hAnsi="Times New Roman" w:cs="Times New Roman"/>
-        </w:rPr>
-        <w:t xml:space="preserve"> </w:t>
-      </w:r>
-      <w:r>
-        <w:rPr>
-          <w:rFonts w:ascii="Times New Roman" w:hAnsi="Times New Roman" w:cs="Times New Roman"/>
-        </w:rPr>
-        <w:t>publicar</w:t>
-      </w:r>
-      <w:r>
-        <w:rPr>
-          <w:rFonts w:ascii="Times New Roman" w:hAnsi="Times New Roman" w:cs="Times New Roman"/>
-        </w:rPr>
-        <w:t xml:space="preserve"> </w:t>
-      </w:r>
-      <w:r>
-        <w:rPr>
-          <w:rFonts w:ascii="Times New Roman" w:hAnsi="Times New Roman" w:cs="Times New Roman"/>
-        </w:rPr>
-        <w:t>una</w:t>
-      </w:r>
-      <w:r>
-        <w:rPr>
-          <w:rFonts w:ascii="Times New Roman" w:hAnsi="Times New Roman" w:cs="Times New Roman"/>
-        </w:rPr>
-        <w:t xml:space="preserve"> </w:t>
-      </w:r>
-      <w:r>
-        <w:rPr>
-          <w:rFonts w:ascii="Times New Roman" w:hAnsi="Times New Roman" w:cs="Times New Roman"/>
-        </w:rPr>
-        <w:t>oferta</w:t>
-      </w:r>
-      <w:r>
-        <w:rPr>
-          <w:rFonts w:ascii="Times New Roman" w:hAnsi="Times New Roman" w:cs="Times New Roman"/>
-        </w:rPr>
-        <w:t xml:space="preserve"> </w:t>
-      </w:r>
-      <w:r>
-        <w:rPr>
-          <w:rFonts w:ascii="Times New Roman" w:hAnsi="Times New Roman" w:cs="Times New Roman"/>
-        </w:rPr>
-        <w:t>nueva,</w:t>
-      </w:r>
-      <w:r>
-        <w:rPr>
-          <w:rFonts w:ascii="Times New Roman" w:hAnsi="Times New Roman" w:cs="Times New Roman"/>
-        </w:rPr>
-        <w:t xml:space="preserve"> </w:t>
-      </w:r>
-      <w:r>
-        <w:rPr>
-          <w:rFonts w:ascii="Times New Roman" w:hAnsi="Times New Roman" w:cs="Times New Roman"/>
-        </w:rPr>
-        <w:t>explorar</w:t>
-      </w:r>
-      <w:r>
-        <w:rPr>
-          <w:rFonts w:ascii="Times New Roman" w:hAnsi="Times New Roman" w:cs="Times New Roman"/>
-        </w:rPr>
-        <w:t xml:space="preserve"> </w:t>
-      </w:r>
-      <w:r>
-        <w:rPr>
-          <w:rFonts w:ascii="Times New Roman" w:hAnsi="Times New Roman" w:cs="Times New Roman"/>
-        </w:rPr>
-        <w:t>las</w:t>
-      </w:r>
-      <w:r>
-        <w:rPr>
-          <w:rFonts w:ascii="Times New Roman" w:hAnsi="Times New Roman" w:cs="Times New Roman"/>
-        </w:rPr>
-        <w:t xml:space="preserve"> </w:t>
-      </w:r>
-      <w:r>
-        <w:rPr>
-          <w:rFonts w:ascii="Times New Roman" w:hAnsi="Times New Roman" w:cs="Times New Roman"/>
-        </w:rPr>
-        <w:t>ofertas</w:t>
-      </w:r>
-      <w:r>
-        <w:rPr>
-          <w:rFonts w:ascii="Times New Roman" w:hAnsi="Times New Roman" w:cs="Times New Roman"/>
-        </w:rPr>
-        <w:t xml:space="preserve"> </w:t>
-      </w:r>
-      <w:r>
-        <w:rPr>
-          <w:rFonts w:ascii="Times New Roman" w:hAnsi="Times New Roman" w:cs="Times New Roman"/>
-        </w:rPr>
-        <w:t>de</w:t>
-      </w:r>
-      <w:r>
-        <w:rPr>
-          <w:rFonts w:ascii="Times New Roman" w:hAnsi="Times New Roman" w:cs="Times New Roman"/>
-        </w:rPr>
-        <w:t xml:space="preserve"> </w:t>
-      </w:r>
-      <w:r>
-        <w:rPr>
-          <w:rFonts w:ascii="Times New Roman" w:hAnsi="Times New Roman" w:cs="Times New Roman"/>
-        </w:rPr>
-        <w:t>otros</w:t>
-      </w:r>
-      <w:r>
-        <w:rPr>
-          <w:rFonts w:ascii="Times New Roman" w:hAnsi="Times New Roman" w:cs="Times New Roman"/>
-        </w:rPr>
-        <w:t xml:space="preserve"> </w:t>
-      </w:r>
-      <w:r>
-        <w:rPr>
-          <w:rFonts w:ascii="Times New Roman" w:hAnsi="Times New Roman" w:cs="Times New Roman"/>
-        </w:rPr>
-        <w:t>usuarios</w:t>
-      </w:r>
-      <w:r>
-        <w:rPr>
-          <w:rFonts w:ascii="Times New Roman" w:hAnsi="Times New Roman" w:cs="Times New Roman"/>
-        </w:rPr>
-        <w:t xml:space="preserve"> </w:t>
-      </w:r>
-      <w:r>
-        <w:rPr>
-          <w:rFonts w:ascii="Times New Roman" w:hAnsi="Times New Roman" w:cs="Times New Roman"/>
-        </w:rPr>
-        <w:t>con</w:t>
-      </w:r>
-      <w:r>
-        <w:rPr>
-          <w:rFonts w:ascii="Times New Roman" w:hAnsi="Times New Roman" w:cs="Times New Roman"/>
-        </w:rPr>
-        <w:t xml:space="preserve"> </w:t>
-      </w:r>
-      <w:r>
-        <w:rPr>
-          <w:rFonts w:ascii="Times New Roman" w:hAnsi="Times New Roman" w:cs="Times New Roman"/>
-        </w:rPr>
-        <w:t>los</w:t>
-      </w:r>
-      <w:r>
-        <w:rPr>
-          <w:rFonts w:ascii="Times New Roman" w:hAnsi="Times New Roman" w:cs="Times New Roman"/>
-        </w:rPr>
-        <w:t xml:space="preserve"> </w:t>
-      </w:r>
-      <w:r>
-        <w:rPr>
-          <w:rFonts w:ascii="Times New Roman" w:hAnsi="Times New Roman" w:cs="Times New Roman"/>
-        </w:rPr>
-        <w:t>filtros</w:t>
-      </w:r>
-      <w:r>
-        <w:rPr>
-          <w:rFonts w:ascii="Times New Roman" w:hAnsi="Times New Roman" w:cs="Times New Roman"/>
-        </w:rPr>
-        <w:t xml:space="preserve"> </w:t>
-      </w:r>
-      <w:r>
-        <w:rPr>
-          <w:rFonts w:ascii="Times New Roman" w:hAnsi="Times New Roman" w:cs="Times New Roman"/>
-        </w:rPr>
-        <w:t>disponibles,</w:t>
-      </w:r>
-      <w:r>
-        <w:rPr>
-          <w:rFonts w:ascii="Times New Roman" w:hAnsi="Times New Roman" w:cs="Times New Roman"/>
-        </w:rPr>
-        <w:t xml:space="preserve"> </w:t>
-      </w:r>
-      <w:r>
-        <w:rPr>
-          <w:rFonts w:ascii="Times New Roman" w:hAnsi="Times New Roman" w:cs="Times New Roman"/>
-        </w:rPr>
-        <w:t>y</w:t>
-      </w:r>
-      <w:r>
-        <w:rPr>
-          <w:rFonts w:ascii="Times New Roman" w:hAnsi="Times New Roman" w:cs="Times New Roman"/>
-        </w:rPr>
-        <w:t xml:space="preserve"> </w:t>
-      </w:r>
-      <w:r>
-        <w:rPr>
-          <w:rFonts w:ascii="Times New Roman" w:hAnsi="Times New Roman" w:cs="Times New Roman"/>
-        </w:rPr>
-        <w:t>cómo</w:t>
-      </w:r>
-      <w:r>
-        <w:rPr>
-          <w:rFonts w:ascii="Times New Roman" w:hAnsi="Times New Roman" w:cs="Times New Roman"/>
-        </w:rPr>
-        <w:t xml:space="preserve"> </w:t>
-      </w:r>
-      <w:r>
-        <w:rPr>
-          <w:rFonts w:ascii="Times New Roman" w:hAnsi="Times New Roman" w:cs="Times New Roman"/>
-          <w:b/>
-          <w:bCs/>
-        </w:rPr>
-        <w:t>editar</w:t>
-      </w:r>
-      <w:r>
-        <w:rPr>
-          <w:rFonts w:ascii="Times New Roman" w:hAnsi="Times New Roman" w:cs="Times New Roman"/>
-          <w:b/>
-          <w:bCs/>
-        </w:rPr>
-        <w:t xml:space="preserve"> </w:t>
-      </w:r>
-      <w:r>
-        <w:rPr>
-          <w:rFonts w:ascii="Times New Roman" w:hAnsi="Times New Roman" w:cs="Times New Roman"/>
-          <w:b/>
-          <w:bCs/>
-        </w:rPr>
-        <w:t>o</w:t>
-      </w:r>
-      <w:r>
-        <w:rPr>
-          <w:rFonts w:ascii="Times New Roman" w:hAnsi="Times New Roman" w:cs="Times New Roman"/>
-          <w:b/>
-          <w:bCs/>
-        </w:rPr>
-        <w:t xml:space="preserve"> </w:t>
-      </w:r>
-      <w:r>
-        <w:rPr>
-          <w:rFonts w:ascii="Times New Roman" w:hAnsi="Times New Roman" w:cs="Times New Roman"/>
-          <w:b/>
-          <w:bCs/>
-        </w:rPr>
-        <w:t>eliminar</w:t>
-      </w:r>
-      <w:r>
-        <w:rPr>
-          <w:rFonts w:ascii="Times New Roman" w:hAnsi="Times New Roman" w:cs="Times New Roman"/>
-        </w:rPr>
-        <w:t xml:space="preserve"> </w:t>
-      </w:r>
-      <w:r>
-        <w:rPr>
-          <w:rFonts w:ascii="Times New Roman" w:hAnsi="Times New Roman" w:cs="Times New Roman"/>
-        </w:rPr>
-        <w:t>una</w:t>
-      </w:r>
-      <w:r>
-        <w:rPr>
-          <w:rFonts w:ascii="Times New Roman" w:hAnsi="Times New Roman" w:cs="Times New Roman"/>
-        </w:rPr>
-        <w:t xml:space="preserve"> </w:t>
-      </w:r>
-      <w:r>
-        <w:rPr>
-          <w:rFonts w:ascii="Times New Roman" w:hAnsi="Times New Roman" w:cs="Times New Roman"/>
-        </w:rPr>
-        <w:t>oferta</w:t>
-      </w:r>
-      <w:r>
-        <w:rPr>
-          <w:rFonts w:ascii="Times New Roman" w:hAnsi="Times New Roman" w:cs="Times New Roman"/>
-        </w:rPr>
-        <w:t xml:space="preserve"> </w:t>
-      </w:r>
-      <w:r>
-        <w:rPr>
-          <w:rFonts w:ascii="Times New Roman" w:hAnsi="Times New Roman" w:cs="Times New Roman"/>
-        </w:rPr>
-        <w:t>propia</w:t>
-      </w:r>
-      <w:r>
-        <w:rPr>
-          <w:rFonts w:ascii="Times New Roman" w:hAnsi="Times New Roman" w:cs="Times New Roman"/>
-        </w:rPr>
-        <w:t xml:space="preserve"> </w:t>
-      </w:r>
-      <w:r>
-        <w:rPr>
-          <w:rFonts w:ascii="Times New Roman" w:hAnsi="Times New Roman" w:cs="Times New Roman"/>
-        </w:rPr>
-        <w:t>ya</w:t>
-      </w:r>
-      <w:r>
-        <w:rPr>
-          <w:rFonts w:ascii="Times New Roman" w:hAnsi="Times New Roman" w:cs="Times New Roman"/>
-        </w:rPr>
-        <w:t xml:space="preserve"> </w:t>
-      </w:r>
-      <w:r>
-        <w:rPr>
-          <w:rFonts w:ascii="Times New Roman" w:hAnsi="Times New Roman" w:cs="Times New Roman"/>
-        </w:rPr>
-        <w:t>publicada.</w:t>
+        </w:rPr>
+        <w:t xml:space="preserve">Propuesta y gestión de trueques. </w:t>
+      </w:r>
+      <w:r>
+        <w:rPr>
+          <w:rFonts w:ascii="Times New Roman" w:hAnsi="Times New Roman"/>
+        </w:rPr>
+        <w:t>Cómo proponer un trueque desde una oferta de interés, indicando qué se ofrece a cambio, y cómo aceptar o rechazar las propuestas recibidas.</w:t>
       </w:r>
     </w:p>
     <w:p>
@@ -7570,7 +6986,7 @@
           <w:b/>
           <w:bCs/>
         </w:rPr>
-        <w:t>Solicitudes</w:t>
+        <w:t>Seguimiento</w:t>
       </w:r>
       <w:r>
         <w:rPr>
@@ -7586,7 +7002,7 @@
           <w:b/>
           <w:bCs/>
         </w:rPr>
-        <w:t>y</w:t>
+        <w:t>de</w:t>
       </w:r>
       <w:r>
         <w:rPr>
@@ -7602,87 +7018,115 @@
           <w:b/>
           <w:bCs/>
         </w:rPr>
-        <w:t>propuestas</w:t>
-      </w:r>
-      <w:r>
-        <w:rPr>
-          <w:rFonts w:ascii="Times New Roman" w:hAnsi="Times New Roman" w:cs="Times New Roman"/>
-          <w:b/>
-          <w:bCs/>
-        </w:rPr>
-        <w:t xml:space="preserve"> </w:t>
-      </w:r>
-      <w:r>
-        <w:rPr>
-          <w:rFonts w:ascii="Times New Roman" w:hAnsi="Times New Roman" w:cs="Times New Roman"/>
-          <w:b/>
-          <w:bCs/>
+        <w:t>trueques.</w:t>
+      </w:r>
+      <w:r>
+        <w:rPr>
+          <w:rFonts w:ascii="Times New Roman" w:hAnsi="Times New Roman" w:cs="Times New Roman"/>
+        </w:rPr>
+        <w:t xml:space="preserve"> </w:t>
+      </w:r>
+      <w:r>
+        <w:rPr>
+          <w:rFonts w:ascii="Times New Roman" w:hAnsi="Times New Roman" w:cs="Times New Roman"/>
+        </w:rPr>
+        <w:t>Uso</w:t>
+      </w:r>
+      <w:r>
+        <w:rPr>
+          <w:rFonts w:ascii="Times New Roman" w:hAnsi="Times New Roman" w:cs="Times New Roman"/>
+        </w:rPr>
+        <w:t xml:space="preserve"> </w:t>
+      </w:r>
+      <w:r>
+        <w:rPr>
+          <w:rFonts w:ascii="Times New Roman" w:hAnsi="Times New Roman" w:cs="Times New Roman"/>
         </w:rPr>
         <w:t>de</w:t>
       </w:r>
       <w:r>
         <w:rPr>
           <w:rFonts w:ascii="Times New Roman" w:hAnsi="Times New Roman" w:cs="Times New Roman"/>
-          <w:b/>
-          <w:bCs/>
-        </w:rPr>
-        <w:t xml:space="preserve"> </w:t>
-      </w:r>
-      <w:r>
-        <w:rPr>
-          <w:rFonts w:ascii="Times New Roman" w:hAnsi="Times New Roman" w:cs="Times New Roman"/>
-          <w:b/>
-          <w:bCs/>
-        </w:rPr>
-        <w:t>trueque.</w:t>
-      </w:r>
-      <w:r>
-        <w:rPr>
-          <w:rFonts w:ascii="Times New Roman" w:hAnsi="Times New Roman" w:cs="Times New Roman"/>
-        </w:rPr>
-        <w:t xml:space="preserve"> </w:t>
-      </w:r>
-      <w:r>
-        <w:rPr>
-          <w:rFonts w:ascii="Times New Roman" w:hAnsi="Times New Roman" w:cs="Times New Roman"/>
-        </w:rPr>
-        <w:t>Cómo</w:t>
-      </w:r>
-      <w:r>
-        <w:rPr>
-          <w:rFonts w:ascii="Times New Roman" w:hAnsi="Times New Roman" w:cs="Times New Roman"/>
-        </w:rPr>
-        <w:t xml:space="preserve"> </w:t>
-      </w:r>
-      <w:r>
-        <w:rPr>
-          <w:rFonts w:ascii="Times New Roman" w:hAnsi="Times New Roman" w:cs="Times New Roman"/>
-        </w:rPr>
-        <w:t>enviar</w:t>
-      </w:r>
-      <w:r>
-        <w:rPr>
-          <w:rFonts w:ascii="Times New Roman" w:hAnsi="Times New Roman" w:cs="Times New Roman"/>
-        </w:rPr>
-        <w:t xml:space="preserve"> </w:t>
-      </w:r>
-      <w:r>
-        <w:rPr>
-          <w:rFonts w:ascii="Times New Roman" w:hAnsi="Times New Roman" w:cs="Times New Roman"/>
-        </w:rPr>
-        <w:t>una</w:t>
-      </w:r>
-      <w:r>
-        <w:rPr>
-          <w:rFonts w:ascii="Times New Roman" w:hAnsi="Times New Roman" w:cs="Times New Roman"/>
-        </w:rPr>
-        <w:t xml:space="preserve"> </w:t>
-      </w:r>
-      <w:r>
-        <w:rPr>
-          <w:rFonts w:ascii="Times New Roman" w:hAnsi="Times New Roman" w:cs="Times New Roman"/>
-        </w:rPr>
-        <w:t>solicitud</w:t>
+        </w:rPr>
+        <w:t xml:space="preserve"> </w:t>
+      </w:r>
+      <w:r>
+        <w:rPr>
+          <w:rFonts w:ascii="Times New Roman" w:hAnsi="Times New Roman" w:cs="Times New Roman"/>
+        </w:rPr>
+        <w:t>la</w:t>
+      </w:r>
+      <w:r>
+        <w:rPr>
+          <w:rFonts w:ascii="Times New Roman" w:hAnsi="Times New Roman" w:cs="Times New Roman"/>
+        </w:rPr>
+        <w:t xml:space="preserve"> </w:t>
+      </w:r>
+      <w:r>
+        <w:rPr>
+          <w:rFonts w:ascii="Times New Roman" w:hAnsi="Times New Roman" w:cs="Times New Roman"/>
+        </w:rPr>
+        <w:t>sección</w:t>
+      </w:r>
+      <w:r>
+        <w:rPr>
+          <w:rFonts w:ascii="Times New Roman" w:hAnsi="Times New Roman" w:cs="Times New Roman"/>
+        </w:rPr>
+        <w:t xml:space="preserve"> </w:t>
+      </w:r>
+      <w:r>
+        <w:rPr>
+          <w:rFonts w:ascii="Times New Roman" w:hAnsi="Times New Roman" w:cs="Times New Roman"/>
+        </w:rPr>
+        <w:t>“Mis</w:t>
+      </w:r>
+      <w:r>
+        <w:rPr>
+          <w:rFonts w:ascii="Times New Roman" w:hAnsi="Times New Roman" w:cs="Times New Roman"/>
+        </w:rPr>
+        <w:t xml:space="preserve"> </w:t>
+      </w:r>
+      <w:r>
+        <w:rPr>
+          <w:rFonts w:ascii="Times New Roman" w:hAnsi="Times New Roman" w:cs="Times New Roman"/>
+        </w:rPr>
+        <w:t>Trueques”,</w:t>
+      </w:r>
+      <w:r>
+        <w:rPr>
+          <w:rFonts w:ascii="Times New Roman" w:hAnsi="Times New Roman" w:cs="Times New Roman"/>
+        </w:rPr>
+        <w:t xml:space="preserve"> </w:t>
+      </w:r>
+      <w:r>
+        <w:rPr>
+          <w:rFonts w:ascii="Times New Roman" w:hAnsi="Times New Roman" w:cs="Times New Roman"/>
+        </w:rPr>
+        <w:t>con</w:t>
+      </w:r>
+      <w:r>
+        <w:rPr>
+          <w:rFonts w:ascii="Times New Roman" w:hAnsi="Times New Roman" w:cs="Times New Roman"/>
+        </w:rPr>
+        <w:t xml:space="preserve"> </w:t>
+      </w:r>
+      <w:r>
+        <w:rPr>
+          <w:rFonts w:ascii="Times New Roman" w:hAnsi="Times New Roman" w:cs="Times New Roman"/>
+        </w:rPr>
+        <w:t>sus</w:t>
+      </w:r>
+      <w:r>
+        <w:rPr>
+          <w:rFonts w:ascii="Times New Roman" w:hAnsi="Times New Roman" w:cs="Times New Roman"/>
+        </w:rPr>
+        <w:t xml:space="preserve"> </w:t>
+      </w:r>
+      <w:r>
+        <w:rPr>
+          <w:rFonts w:ascii="Times New Roman" w:hAnsi="Times New Roman" w:cs="Times New Roman"/>
+        </w:rPr>
+        <w:t>pestañas</w:t>
       </w:r>
       <w:r>
         <w:rPr>
@@ -7706,43 +7150,79 @@
         <w:rPr>
           <w:rFonts w:ascii="Times New Roman" w:hAnsi="Times New Roman" w:cs="Times New Roman"/>
         </w:rPr>
-        <w:t>contacto</w:t>
-      </w:r>
-      <w:r>
-        <w:rPr>
-          <w:rFonts w:ascii="Times New Roman" w:hAnsi="Times New Roman" w:cs="Times New Roman"/>
-        </w:rPr>
-        <w:t xml:space="preserve"> </w:t>
-      </w:r>
-      <w:r>
-        <w:rPr>
-          <w:rFonts w:ascii="Times New Roman" w:hAnsi="Times New Roman" w:cs="Times New Roman"/>
-        </w:rPr>
-        <w:t>sobre</w:t>
-      </w:r>
-      <w:r>
-        <w:rPr>
-          <w:rFonts w:ascii="Times New Roman" w:hAnsi="Times New Roman" w:cs="Times New Roman"/>
-        </w:rPr>
-        <w:t xml:space="preserve"> </w:t>
-      </w:r>
-      <w:r>
-        <w:rPr>
-          <w:rFonts w:ascii="Times New Roman" w:hAnsi="Times New Roman" w:cs="Times New Roman"/>
-        </w:rPr>
-        <w:t>una</w:t>
-      </w:r>
-      <w:r>
-        <w:rPr>
-          <w:rFonts w:ascii="Times New Roman" w:hAnsi="Times New Roman" w:cs="Times New Roman"/>
-        </w:rPr>
-        <w:t xml:space="preserve"> </w:t>
-      </w:r>
-      <w:r>
-        <w:rPr>
-          <w:rFonts w:ascii="Times New Roman" w:hAnsi="Times New Roman" w:cs="Times New Roman"/>
-        </w:rPr>
-        <w:t>oferta,</w:t>
+        <w:t>trueques</w:t>
+      </w:r>
+      <w:r>
+        <w:rPr>
+          <w:rFonts w:ascii="Times New Roman" w:hAnsi="Times New Roman" w:cs="Times New Roman"/>
+        </w:rPr>
+        <w:t xml:space="preserve"> </w:t>
+      </w:r>
+      <w:r>
+        <w:rPr>
+          <w:rFonts w:ascii="Times New Roman" w:hAnsi="Times New Roman" w:cs="Times New Roman"/>
+        </w:rPr>
+        <w:t>pendientes,</w:t>
+      </w:r>
+      <w:r>
+        <w:rPr>
+          <w:rFonts w:ascii="Times New Roman" w:hAnsi="Times New Roman" w:cs="Times New Roman"/>
+        </w:rPr>
+        <w:t xml:space="preserve"> </w:t>
+      </w:r>
+      <w:r>
+        <w:rPr>
+          <w:rFonts w:ascii="Times New Roman" w:hAnsi="Times New Roman" w:cs="Times New Roman"/>
+        </w:rPr>
+        <w:t>aceptados,</w:t>
+      </w:r>
+      <w:r>
+        <w:rPr>
+          <w:rFonts w:ascii="Times New Roman" w:hAnsi="Times New Roman" w:cs="Times New Roman"/>
+        </w:rPr>
+        <w:t xml:space="preserve"> </w:t>
+      </w:r>
+      <w:r>
+        <w:rPr>
+          <w:rFonts w:ascii="Times New Roman" w:hAnsi="Times New Roman" w:cs="Times New Roman"/>
+        </w:rPr>
+        <w:t>completados</w:t>
+      </w:r>
+      <w:r>
+        <w:rPr>
+          <w:rFonts w:ascii="Times New Roman" w:hAnsi="Times New Roman" w:cs="Times New Roman"/>
+        </w:rPr>
+        <w:t xml:space="preserve"> </w:t>
+      </w:r>
+      <w:r>
+        <w:rPr>
+          <w:rFonts w:ascii="Times New Roman" w:hAnsi="Times New Roman" w:cs="Times New Roman"/>
+        </w:rPr>
+        <w:t>y</w:t>
+      </w:r>
+      <w:r>
+        <w:rPr>
+          <w:rFonts w:ascii="Times New Roman" w:hAnsi="Times New Roman" w:cs="Times New Roman"/>
+        </w:rPr>
+        <w:t xml:space="preserve"> </w:t>
+      </w:r>
+      <w:r>
+        <w:rPr>
+          <w:rFonts w:ascii="Times New Roman" w:hAnsi="Times New Roman" w:cs="Times New Roman"/>
+        </w:rPr>
+        <w:t>cancelados,</w:t>
+      </w:r>
+      <w:r>
+        <w:rPr>
+          <w:rFonts w:ascii="Times New Roman" w:hAnsi="Times New Roman" w:cs="Times New Roman"/>
+        </w:rPr>
+        <w:t xml:space="preserve"> </w:t>
+      </w:r>
+      <w:r>
+        <w:rPr>
+          <w:rFonts w:ascii="Times New Roman" w:hAnsi="Times New Roman" w:cs="Times New Roman"/>
+        </w:rPr>
+        <w:t>y</w:t>
       </w:r>
       <w:r>
         <w:rPr>
@@ -7766,67 +7246,31 @@
         <w:rPr>
           <w:rFonts w:ascii="Times New Roman" w:hAnsi="Times New Roman" w:cs="Times New Roman"/>
         </w:rPr>
-        <w:t>aceptar</w:t>
-      </w:r>
-      <w:r>
-        <w:rPr>
-          <w:rFonts w:ascii="Times New Roman" w:hAnsi="Times New Roman" w:cs="Times New Roman"/>
-        </w:rPr>
-        <w:t xml:space="preserve"> </w:t>
-      </w:r>
-      <w:r>
-        <w:rPr>
-          <w:rFonts w:ascii="Times New Roman" w:hAnsi="Times New Roman" w:cs="Times New Roman"/>
-        </w:rPr>
-        <w:t>o</w:t>
-      </w:r>
-      <w:r>
-        <w:rPr>
-          <w:rFonts w:ascii="Times New Roman" w:hAnsi="Times New Roman" w:cs="Times New Roman"/>
-        </w:rPr>
-        <w:t xml:space="preserve"> </w:t>
-      </w:r>
-      <w:r>
-        <w:rPr>
-          <w:rFonts w:ascii="Times New Roman" w:hAnsi="Times New Roman" w:cs="Times New Roman"/>
-        </w:rPr>
-        <w:t>rechazar</w:t>
-      </w:r>
-      <w:r>
-        <w:rPr>
-          <w:rFonts w:ascii="Times New Roman" w:hAnsi="Times New Roman" w:cs="Times New Roman"/>
-        </w:rPr>
-        <w:t xml:space="preserve"> </w:t>
-      </w:r>
-      <w:r>
-        <w:rPr>
-          <w:rFonts w:ascii="Times New Roman" w:hAnsi="Times New Roman" w:cs="Times New Roman"/>
-        </w:rPr>
-        <w:t>las</w:t>
-      </w:r>
-      <w:r>
-        <w:rPr>
-          <w:rFonts w:ascii="Times New Roman" w:hAnsi="Times New Roman" w:cs="Times New Roman"/>
-        </w:rPr>
-        <w:t xml:space="preserve"> </w:t>
-      </w:r>
-      <w:r>
-        <w:rPr>
-          <w:rFonts w:ascii="Times New Roman" w:hAnsi="Times New Roman" w:cs="Times New Roman"/>
-        </w:rPr>
-        <w:t>solicitudes</w:t>
-      </w:r>
-      <w:r>
-        <w:rPr>
-          <w:rFonts w:ascii="Times New Roman" w:hAnsi="Times New Roman" w:cs="Times New Roman"/>
-        </w:rPr>
-        <w:t xml:space="preserve"> </w:t>
-      </w:r>
-      <w:r>
-        <w:rPr>
-          <w:rFonts w:ascii="Times New Roman" w:hAnsi="Times New Roman" w:cs="Times New Roman"/>
-        </w:rPr>
-        <w:t>recibidas,</w:t>
+        <w:t>completar</w:t>
+      </w:r>
+      <w:r>
+        <w:rPr>
+          <w:rFonts w:ascii="Times New Roman" w:hAnsi="Times New Roman" w:cs="Times New Roman"/>
+        </w:rPr>
+        <w:t xml:space="preserve"> </w:t>
+      </w:r>
+      <w:r>
+        <w:rPr>
+          <w:rFonts w:ascii="Times New Roman" w:hAnsi="Times New Roman" w:cs="Times New Roman"/>
+        </w:rPr>
+        <w:t>un</w:t>
+      </w:r>
+      <w:r>
+        <w:rPr>
+          <w:rFonts w:ascii="Times New Roman" w:hAnsi="Times New Roman" w:cs="Times New Roman"/>
+        </w:rPr>
+        <w:t xml:space="preserve"> </w:t>
+      </w:r>
+      <w:r>
+        <w:rPr>
+          <w:rFonts w:ascii="Times New Roman" w:hAnsi="Times New Roman" w:cs="Times New Roman"/>
+        </w:rPr>
+        <w:t>trueque</w:t>
       </w:r>
       <w:r>
         <w:rPr>
@@ -7850,55 +7294,79 @@
         <w:rPr>
           <w:rFonts w:ascii="Times New Roman" w:hAnsi="Times New Roman" w:cs="Times New Roman"/>
         </w:rPr>
-        <w:t>cómo</w:t>
-      </w:r>
-      <w:r>
-        <w:rPr>
-          <w:rFonts w:ascii="Times New Roman" w:hAnsi="Times New Roman" w:cs="Times New Roman"/>
-        </w:rPr>
-        <w:t xml:space="preserve"> </w:t>
-      </w:r>
-      <w:r>
-        <w:rPr>
-          <w:rFonts w:ascii="Times New Roman" w:hAnsi="Times New Roman" w:cs="Times New Roman"/>
-        </w:rPr>
-        <w:t>proponer</w:t>
-      </w:r>
-      <w:r>
-        <w:rPr>
-          <w:rFonts w:ascii="Times New Roman" w:hAnsi="Times New Roman" w:cs="Times New Roman"/>
-        </w:rPr>
-        <w:t xml:space="preserve"> </w:t>
-      </w:r>
-      <w:r>
-        <w:rPr>
-          <w:rFonts w:ascii="Times New Roman" w:hAnsi="Times New Roman" w:cs="Times New Roman"/>
-        </w:rPr>
-        <w:t>formalmente</w:t>
-      </w:r>
-      <w:r>
-        <w:rPr>
-          <w:rFonts w:ascii="Times New Roman" w:hAnsi="Times New Roman" w:cs="Times New Roman"/>
-        </w:rPr>
-        <w:t xml:space="preserve"> </w:t>
-      </w:r>
-      <w:r>
-        <w:rPr>
-          <w:rFonts w:ascii="Times New Roman" w:hAnsi="Times New Roman" w:cs="Times New Roman"/>
-        </w:rPr>
-        <w:t>un</w:t>
-      </w:r>
-      <w:r>
-        <w:rPr>
-          <w:rFonts w:ascii="Times New Roman" w:hAnsi="Times New Roman" w:cs="Times New Roman"/>
-        </w:rPr>
-        <w:t xml:space="preserve"> </w:t>
-      </w:r>
-      <w:r>
-        <w:rPr>
-          <w:rFonts w:ascii="Times New Roman" w:hAnsi="Times New Roman" w:cs="Times New Roman"/>
-        </w:rPr>
-        <w:t>trueque.</w:t>
+        <w:t>calificar</w:t>
+      </w:r>
+      <w:r>
+        <w:rPr>
+          <w:rFonts w:ascii="Times New Roman" w:hAnsi="Times New Roman" w:cs="Times New Roman"/>
+        </w:rPr>
+        <w:t xml:space="preserve"> </w:t>
+      </w:r>
+      <w:r>
+        <w:rPr>
+          <w:rFonts w:ascii="Times New Roman" w:hAnsi="Times New Roman" w:cs="Times New Roman"/>
+        </w:rPr>
+        <w:t>a</w:t>
+      </w:r>
+      <w:r>
+        <w:rPr>
+          <w:rFonts w:ascii="Times New Roman" w:hAnsi="Times New Roman" w:cs="Times New Roman"/>
+        </w:rPr>
+        <w:t xml:space="preserve"> </w:t>
+      </w:r>
+      <w:r>
+        <w:rPr>
+          <w:rFonts w:ascii="Times New Roman" w:hAnsi="Times New Roman" w:cs="Times New Roman"/>
+        </w:rPr>
+        <w:t>la</w:t>
+      </w:r>
+      <w:r>
+        <w:rPr>
+          <w:rFonts w:ascii="Times New Roman" w:hAnsi="Times New Roman" w:cs="Times New Roman"/>
+        </w:rPr>
+        <w:t xml:space="preserve"> </w:t>
+      </w:r>
+      <w:r>
+        <w:rPr>
+          <w:rFonts w:ascii="Times New Roman" w:hAnsi="Times New Roman" w:cs="Times New Roman"/>
+        </w:rPr>
+        <w:t>otra</w:t>
+      </w:r>
+      <w:r>
+        <w:rPr>
+          <w:rFonts w:ascii="Times New Roman" w:hAnsi="Times New Roman" w:cs="Times New Roman"/>
+        </w:rPr>
+        <w:t xml:space="preserve"> </w:t>
+      </w:r>
+      <w:r>
+        <w:rPr>
+          <w:rFonts w:ascii="Times New Roman" w:hAnsi="Times New Roman" w:cs="Times New Roman"/>
+        </w:rPr>
+        <w:t>persona</w:t>
+      </w:r>
+      <w:r>
+        <w:rPr>
+          <w:rFonts w:ascii="Times New Roman" w:hAnsi="Times New Roman" w:cs="Times New Roman"/>
+        </w:rPr>
+        <w:t xml:space="preserve"> </w:t>
+      </w:r>
+      <w:r>
+        <w:rPr>
+          <w:rFonts w:ascii="Times New Roman" w:hAnsi="Times New Roman" w:cs="Times New Roman"/>
+        </w:rPr>
+        <w:t>al</w:t>
+      </w:r>
+      <w:r>
+        <w:rPr>
+          <w:rFonts w:ascii="Times New Roman" w:hAnsi="Times New Roman" w:cs="Times New Roman"/>
+        </w:rPr>
+        <w:t xml:space="preserve"> </w:t>
+      </w:r>
+      <w:r>
+        <w:rPr>
+          <w:rFonts w:ascii="Times New Roman" w:hAnsi="Times New Roman" w:cs="Times New Roman"/>
+        </w:rPr>
+        <w:t>finalizar.</w:t>
       </w:r>
     </w:p>
     <w:p>
@@ -7914,391 +7382,16 @@
       </w:pPr>
       <w:r>
         <w:rPr>
-          <w:rFonts w:ascii="Times New Roman" w:hAnsi="Times New Roman" w:cs="Times New Roman"/>
+          <w:rFonts w:ascii="Times New Roman" w:hAnsi="Times New Roman"/>
           <w:b/>
-          <w:bCs/>
-        </w:rPr>
-        <w:t>Seguimiento</w:t>
-      </w:r>
-      <w:r>
-        <w:rPr>
-          <w:rFonts w:ascii="Times New Roman" w:hAnsi="Times New Roman" w:cs="Times New Roman"/>
-          <w:b/>
-          <w:bCs/>
-        </w:rPr>
-        <w:t xml:space="preserve"> </w:t>
-      </w:r>
-      <w:r>
-        <w:rPr>
-          <w:rFonts w:ascii="Times New Roman" w:hAnsi="Times New Roman" w:cs="Times New Roman"/>
-          <w:b/>
-          <w:bCs/>
-        </w:rPr>
-        <w:t>de</w:t>
-      </w:r>
-      <w:r>
-        <w:rPr>
-          <w:rFonts w:ascii="Times New Roman" w:hAnsi="Times New Roman" w:cs="Times New Roman"/>
-          <w:b/>
-          <w:bCs/>
-        </w:rPr>
-        <w:t xml:space="preserve"> </w:t>
-      </w:r>
-      <w:r>
-        <w:rPr>
-          <w:rFonts w:ascii="Times New Roman" w:hAnsi="Times New Roman" w:cs="Times New Roman"/>
-          <w:b/>
-          <w:bCs/>
-        </w:rPr>
-        <w:t>trueques.</w:t>
-      </w:r>
-      <w:r>
-        <w:rPr>
-          <w:rFonts w:ascii="Times New Roman" w:hAnsi="Times New Roman" w:cs="Times New Roman"/>
-        </w:rPr>
-        <w:t xml:space="preserve"> </w:t>
-      </w:r>
-      <w:r>
-        <w:rPr>
-          <w:rFonts w:ascii="Times New Roman" w:hAnsi="Times New Roman" w:cs="Times New Roman"/>
-        </w:rPr>
-        <w:t>Uso</w:t>
-      </w:r>
-      <w:r>
-        <w:rPr>
-          <w:rFonts w:ascii="Times New Roman" w:hAnsi="Times New Roman" w:cs="Times New Roman"/>
-        </w:rPr>
-        <w:t xml:space="preserve"> </w:t>
-      </w:r>
-      <w:r>
-        <w:rPr>
-          <w:rFonts w:ascii="Times New Roman" w:hAnsi="Times New Roman" w:cs="Times New Roman"/>
-        </w:rPr>
-        <w:t>de</w:t>
-      </w:r>
-      <w:r>
-        <w:rPr>
-          <w:rFonts w:ascii="Times New Roman" w:hAnsi="Times New Roman" w:cs="Times New Roman"/>
-        </w:rPr>
-        <w:t xml:space="preserve"> </w:t>
-      </w:r>
-      <w:r>
-        <w:rPr>
-          <w:rFonts w:ascii="Times New Roman" w:hAnsi="Times New Roman" w:cs="Times New Roman"/>
-        </w:rPr>
-        <w:t>la</w:t>
-      </w:r>
-      <w:r>
-        <w:rPr>
-          <w:rFonts w:ascii="Times New Roman" w:hAnsi="Times New Roman" w:cs="Times New Roman"/>
-        </w:rPr>
-        <w:t xml:space="preserve"> </w:t>
-      </w:r>
-      <w:r>
-        <w:rPr>
-          <w:rFonts w:ascii="Times New Roman" w:hAnsi="Times New Roman" w:cs="Times New Roman"/>
-        </w:rPr>
-        <w:t>sección</w:t>
-      </w:r>
-      <w:r>
-        <w:rPr>
-          <w:rFonts w:ascii="Times New Roman" w:hAnsi="Times New Roman" w:cs="Times New Roman"/>
-        </w:rPr>
-        <w:t xml:space="preserve"> </w:t>
-      </w:r>
-      <w:r>
-        <w:rPr>
-          <w:rFonts w:ascii="Times New Roman" w:hAnsi="Times New Roman" w:cs="Times New Roman"/>
-        </w:rPr>
-        <w:t>“Mis</w:t>
-      </w:r>
-      <w:r>
-        <w:rPr>
-          <w:rFonts w:ascii="Times New Roman" w:hAnsi="Times New Roman" w:cs="Times New Roman"/>
-        </w:rPr>
-        <w:t xml:space="preserve"> </w:t>
-      </w:r>
-      <w:r>
-        <w:rPr>
-          <w:rFonts w:ascii="Times New Roman" w:hAnsi="Times New Roman" w:cs="Times New Roman"/>
-        </w:rPr>
-        <w:t>Trueques”,</w:t>
-      </w:r>
-      <w:r>
-        <w:rPr>
-          <w:rFonts w:ascii="Times New Roman" w:hAnsi="Times New Roman" w:cs="Times New Roman"/>
-        </w:rPr>
-        <w:t xml:space="preserve"> </w:t>
-      </w:r>
-      <w:r>
-        <w:rPr>
-          <w:rFonts w:ascii="Times New Roman" w:hAnsi="Times New Roman" w:cs="Times New Roman"/>
-        </w:rPr>
-        <w:t>con</w:t>
-      </w:r>
-      <w:r>
-        <w:rPr>
-          <w:rFonts w:ascii="Times New Roman" w:hAnsi="Times New Roman" w:cs="Times New Roman"/>
-        </w:rPr>
-        <w:t xml:space="preserve"> </w:t>
-      </w:r>
-      <w:r>
-        <w:rPr>
-          <w:rFonts w:ascii="Times New Roman" w:hAnsi="Times New Roman" w:cs="Times New Roman"/>
-        </w:rPr>
-        <w:t>sus</w:t>
-      </w:r>
-      <w:r>
-        <w:rPr>
-          <w:rFonts w:ascii="Times New Roman" w:hAnsi="Times New Roman" w:cs="Times New Roman"/>
-        </w:rPr>
-        <w:t xml:space="preserve"> </w:t>
-      </w:r>
-      <w:r>
-        <w:rPr>
-          <w:rFonts w:ascii="Times New Roman" w:hAnsi="Times New Roman" w:cs="Times New Roman"/>
-        </w:rPr>
-        <w:t>pestañas</w:t>
-      </w:r>
-      <w:r>
-        <w:rPr>
-          <w:rFonts w:ascii="Times New Roman" w:hAnsi="Times New Roman" w:cs="Times New Roman"/>
-        </w:rPr>
-        <w:t xml:space="preserve"> </w:t>
-      </w:r>
-      <w:r>
-        <w:rPr>
-          <w:rFonts w:ascii="Times New Roman" w:hAnsi="Times New Roman" w:cs="Times New Roman"/>
-        </w:rPr>
-        <w:t>de</w:t>
-      </w:r>
-      <w:r>
-        <w:rPr>
-          <w:rFonts w:ascii="Times New Roman" w:hAnsi="Times New Roman" w:cs="Times New Roman"/>
-        </w:rPr>
-        <w:t xml:space="preserve"> </w:t>
-      </w:r>
-      <w:r>
-        <w:rPr>
-          <w:rFonts w:ascii="Times New Roman" w:hAnsi="Times New Roman" w:cs="Times New Roman"/>
-        </w:rPr>
-        <w:t>trueques</w:t>
-      </w:r>
-      <w:r>
-        <w:rPr>
-          <w:rFonts w:ascii="Times New Roman" w:hAnsi="Times New Roman" w:cs="Times New Roman"/>
-        </w:rPr>
-        <w:t xml:space="preserve"> </w:t>
-      </w:r>
-      <w:r>
-        <w:rPr>
-          <w:rFonts w:ascii="Times New Roman" w:hAnsi="Times New Roman" w:cs="Times New Roman"/>
-        </w:rPr>
-        <w:t>pendientes,</w:t>
-      </w:r>
-      <w:r>
-        <w:rPr>
-          <w:rFonts w:ascii="Times New Roman" w:hAnsi="Times New Roman" w:cs="Times New Roman"/>
-        </w:rPr>
-        <w:t xml:space="preserve"> </w:t>
-      </w:r>
-      <w:r>
-        <w:rPr>
-          <w:rFonts w:ascii="Times New Roman" w:hAnsi="Times New Roman" w:cs="Times New Roman"/>
-        </w:rPr>
-        <w:t>aceptados,</w:t>
-      </w:r>
-      <w:r>
-        <w:rPr>
-          <w:rFonts w:ascii="Times New Roman" w:hAnsi="Times New Roman" w:cs="Times New Roman"/>
-        </w:rPr>
-        <w:t xml:space="preserve"> </w:t>
-      </w:r>
-      <w:r>
-        <w:rPr>
-          <w:rFonts w:ascii="Times New Roman" w:hAnsi="Times New Roman" w:cs="Times New Roman"/>
-        </w:rPr>
-        <w:t>completados</w:t>
-      </w:r>
-      <w:r>
-        <w:rPr>
-          <w:rFonts w:ascii="Times New Roman" w:hAnsi="Times New Roman" w:cs="Times New Roman"/>
-        </w:rPr>
-        <w:t xml:space="preserve"> </w:t>
-      </w:r>
-      <w:r>
-        <w:rPr>
-          <w:rFonts w:ascii="Times New Roman" w:hAnsi="Times New Roman" w:cs="Times New Roman"/>
-        </w:rPr>
-        <w:t>y</w:t>
-      </w:r>
-      <w:r>
-        <w:rPr>
-          <w:rFonts w:ascii="Times New Roman" w:hAnsi="Times New Roman" w:cs="Times New Roman"/>
-        </w:rPr>
-        <w:t xml:space="preserve"> </w:t>
-      </w:r>
-      <w:r>
-        <w:rPr>
-          <w:rFonts w:ascii="Times New Roman" w:hAnsi="Times New Roman" w:cs="Times New Roman"/>
-        </w:rPr>
-        <w:t>cancelados,</w:t>
-      </w:r>
-      <w:r>
-        <w:rPr>
-          <w:rFonts w:ascii="Times New Roman" w:hAnsi="Times New Roman" w:cs="Times New Roman"/>
-        </w:rPr>
-        <w:t xml:space="preserve"> </w:t>
-      </w:r>
-      <w:r>
-        <w:rPr>
-          <w:rFonts w:ascii="Times New Roman" w:hAnsi="Times New Roman" w:cs="Times New Roman"/>
-        </w:rPr>
-        <w:t>y</w:t>
-      </w:r>
-      <w:r>
-        <w:rPr>
-          <w:rFonts w:ascii="Times New Roman" w:hAnsi="Times New Roman" w:cs="Times New Roman"/>
-        </w:rPr>
-        <w:t xml:space="preserve"> </w:t>
-      </w:r>
-      <w:r>
-        <w:rPr>
-          <w:rFonts w:ascii="Times New Roman" w:hAnsi="Times New Roman" w:cs="Times New Roman"/>
-        </w:rPr>
-        <w:t>cómo</w:t>
-      </w:r>
-      <w:r>
-        <w:rPr>
-          <w:rFonts w:ascii="Times New Roman" w:hAnsi="Times New Roman" w:cs="Times New Roman"/>
-        </w:rPr>
-        <w:t xml:space="preserve"> </w:t>
-      </w:r>
-      <w:r>
-        <w:rPr>
-          <w:rFonts w:ascii="Times New Roman" w:hAnsi="Times New Roman" w:cs="Times New Roman"/>
-        </w:rPr>
-        <w:t>completar</w:t>
-      </w:r>
-      <w:r>
-        <w:rPr>
-          <w:rFonts w:ascii="Times New Roman" w:hAnsi="Times New Roman" w:cs="Times New Roman"/>
-        </w:rPr>
-        <w:t xml:space="preserve"> </w:t>
-      </w:r>
-      <w:r>
-        <w:rPr>
-          <w:rFonts w:ascii="Times New Roman" w:hAnsi="Times New Roman" w:cs="Times New Roman"/>
-        </w:rPr>
-        <w:t>un</w:t>
-      </w:r>
-      <w:r>
-        <w:rPr>
-          <w:rFonts w:ascii="Times New Roman" w:hAnsi="Times New Roman" w:cs="Times New Roman"/>
-        </w:rPr>
-        <w:t xml:space="preserve"> </w:t>
-      </w:r>
-      <w:r>
-        <w:rPr>
-          <w:rFonts w:ascii="Times New Roman" w:hAnsi="Times New Roman" w:cs="Times New Roman"/>
-        </w:rPr>
-        <w:t>trueque</w:t>
-      </w:r>
-      <w:r>
-        <w:rPr>
-          <w:rFonts w:ascii="Times New Roman" w:hAnsi="Times New Roman" w:cs="Times New Roman"/>
-        </w:rPr>
-        <w:t xml:space="preserve"> </w:t>
-      </w:r>
-      <w:r>
-        <w:rPr>
-          <w:rFonts w:ascii="Times New Roman" w:hAnsi="Times New Roman" w:cs="Times New Roman"/>
-        </w:rPr>
-        <w:t>y</w:t>
-      </w:r>
-      <w:r>
-        <w:rPr>
-          <w:rFonts w:ascii="Times New Roman" w:hAnsi="Times New Roman" w:cs="Times New Roman"/>
-        </w:rPr>
-        <w:t xml:space="preserve"> </w:t>
-      </w:r>
-      <w:r>
-        <w:rPr>
-          <w:rFonts w:ascii="Times New Roman" w:hAnsi="Times New Roman" w:cs="Times New Roman"/>
-        </w:rPr>
-        <w:t>calificar</w:t>
-      </w:r>
-      <w:r>
-        <w:rPr>
-          <w:rFonts w:ascii="Times New Roman" w:hAnsi="Times New Roman" w:cs="Times New Roman"/>
-        </w:rPr>
-        <w:t xml:space="preserve"> </w:t>
-      </w:r>
-      <w:r>
-        <w:rPr>
-          <w:rFonts w:ascii="Times New Roman" w:hAnsi="Times New Roman" w:cs="Times New Roman"/>
-        </w:rPr>
-        <w:t>a</w:t>
-      </w:r>
-      <w:r>
-        <w:rPr>
-          <w:rFonts w:ascii="Times New Roman" w:hAnsi="Times New Roman" w:cs="Times New Roman"/>
-        </w:rPr>
-        <w:t xml:space="preserve"> </w:t>
-      </w:r>
-      <w:r>
-        <w:rPr>
-          <w:rFonts w:ascii="Times New Roman" w:hAnsi="Times New Roman" w:cs="Times New Roman"/>
-        </w:rPr>
-        <w:t>la</w:t>
-      </w:r>
-      <w:r>
-        <w:rPr>
-          <w:rFonts w:ascii="Times New Roman" w:hAnsi="Times New Roman" w:cs="Times New Roman"/>
-        </w:rPr>
-        <w:t xml:space="preserve"> </w:t>
-      </w:r>
-      <w:r>
-        <w:rPr>
-          <w:rFonts w:ascii="Times New Roman" w:hAnsi="Times New Roman" w:cs="Times New Roman"/>
-        </w:rPr>
-        <w:t>otra</w:t>
-      </w:r>
-      <w:r>
-        <w:rPr>
-          <w:rFonts w:ascii="Times New Roman" w:hAnsi="Times New Roman" w:cs="Times New Roman"/>
-        </w:rPr>
-        <w:t xml:space="preserve"> </w:t>
-      </w:r>
-      <w:r>
-        <w:rPr>
-          <w:rFonts w:ascii="Times New Roman" w:hAnsi="Times New Roman" w:cs="Times New Roman"/>
-        </w:rPr>
-        <w:t>persona</w:t>
-      </w:r>
-      <w:r>
-        <w:rPr>
-          <w:rFonts w:ascii="Times New Roman" w:hAnsi="Times New Roman" w:cs="Times New Roman"/>
-        </w:rPr>
-        <w:t xml:space="preserve"> </w:t>
-      </w:r>
-      <w:r>
-        <w:rPr>
-          <w:rFonts w:ascii="Times New Roman" w:hAnsi="Times New Roman" w:cs="Times New Roman"/>
-        </w:rPr>
-        <w:t>al</w:t>
-      </w:r>
-      <w:r>
-        <w:rPr>
-          <w:rFonts w:ascii="Times New Roman" w:hAnsi="Times New Roman" w:cs="Times New Roman"/>
-        </w:rPr>
-        <w:t xml:space="preserve"> </w:t>
-      </w:r>
-      <w:r>
-        <w:rPr>
-          <w:rFonts w:ascii="Times New Roman" w:hAnsi="Times New Roman" w:cs="Times New Roman"/>
-        </w:rPr>
-        <w:t>finalizar.</w:t>
+        </w:rPr>
+        <w:t xml:space="preserve">Chat. </w:t>
+      </w:r>
+      <w:r>
+        <w:rPr>
+          <w:rFonts w:ascii="Times New Roman" w:hAnsi="Times New Roman"/>
+        </w:rPr>
+        <w:t>Uso de la mensajería interna de la plataforma para coordinar los detalles de la entrega o el encuentro con la otra persona una vez aceptado un trueque.</w:t>
       </w:r>
     </w:p>
     <w:p>
@@ -8519,702 +7612,6 @@
           <w:rFonts w:ascii="Times New Roman" w:hAnsi="Times New Roman" w:cs="Times New Roman"/>
         </w:rPr>
         <w:t>sistema.</w:t>
-      </w:r>
-    </w:p>
-    <w:p>
-      <w:pPr>
-        <w:numPr>
-          <w:ilvl w:val="0"/>
-          <w:numId w:val="3"/>
-        </w:numPr>
-        <w:spacing w:line="360" w:lineRule="auto"/>
-        <w:rPr>
-          <w:rFonts w:ascii="Times New Roman" w:hAnsi="Times New Roman" w:cs="Times New Roman"/>
-        </w:rPr>
-      </w:pPr>
-      <w:r>
-        <w:rPr>
-          <w:rFonts w:ascii="Times New Roman" w:hAnsi="Times New Roman" w:cs="Times New Roman"/>
-          <w:b/>
-          <w:bCs/>
-        </w:rPr>
-        <w:t>Reportes</w:t>
-      </w:r>
-      <w:r>
-        <w:rPr>
-          <w:rFonts w:ascii="Times New Roman" w:hAnsi="Times New Roman" w:cs="Times New Roman"/>
-          <w:b/>
-          <w:bCs/>
-        </w:rPr>
-        <w:t xml:space="preserve"> </w:t>
-      </w:r>
-      <w:r>
-        <w:rPr>
-          <w:rFonts w:ascii="Times New Roman" w:hAnsi="Times New Roman" w:cs="Times New Roman"/>
-          <w:b/>
-          <w:bCs/>
-        </w:rPr>
-        <w:t>y</w:t>
-      </w:r>
-      <w:r>
-        <w:rPr>
-          <w:rFonts w:ascii="Times New Roman" w:hAnsi="Times New Roman" w:cs="Times New Roman"/>
-          <w:b/>
-          <w:bCs/>
-        </w:rPr>
-        <w:t xml:space="preserve"> </w:t>
-      </w:r>
-      <w:r>
-        <w:rPr>
-          <w:rFonts w:ascii="Times New Roman" w:hAnsi="Times New Roman" w:cs="Times New Roman"/>
-          <w:b/>
-          <w:bCs/>
-        </w:rPr>
-        <w:t>seguridad.</w:t>
-      </w:r>
-      <w:r>
-        <w:rPr>
-          <w:rFonts w:ascii="Times New Roman" w:hAnsi="Times New Roman" w:cs="Times New Roman"/>
-        </w:rPr>
-        <w:t xml:space="preserve"> </w:t>
-      </w:r>
-      <w:r>
-        <w:rPr>
-          <w:rFonts w:ascii="Times New Roman" w:hAnsi="Times New Roman" w:cs="Times New Roman"/>
-        </w:rPr>
-        <w:t>Cómo</w:t>
-      </w:r>
-      <w:r>
-        <w:rPr>
-          <w:rFonts w:ascii="Times New Roman" w:hAnsi="Times New Roman" w:cs="Times New Roman"/>
-        </w:rPr>
-        <w:t xml:space="preserve"> </w:t>
-      </w:r>
-      <w:r>
-        <w:rPr>
-          <w:rFonts w:ascii="Times New Roman" w:hAnsi="Times New Roman" w:cs="Times New Roman"/>
-        </w:rPr>
-        <w:t>reportar</w:t>
-      </w:r>
-      <w:r>
-        <w:rPr>
-          <w:rFonts w:ascii="Times New Roman" w:hAnsi="Times New Roman" w:cs="Times New Roman"/>
-        </w:rPr>
-        <w:t xml:space="preserve"> </w:t>
-      </w:r>
-      <w:r>
-        <w:rPr>
-          <w:rFonts w:ascii="Times New Roman" w:hAnsi="Times New Roman" w:cs="Times New Roman"/>
-        </w:rPr>
-        <w:t>un</w:t>
-      </w:r>
-      <w:r>
-        <w:rPr>
-          <w:rFonts w:ascii="Times New Roman" w:hAnsi="Times New Roman" w:cs="Times New Roman"/>
-        </w:rPr>
-        <w:t xml:space="preserve"> </w:t>
-      </w:r>
-      <w:r>
-        <w:rPr>
-          <w:rFonts w:ascii="Times New Roman" w:hAnsi="Times New Roman" w:cs="Times New Roman"/>
-        </w:rPr>
-        <w:t>problema</w:t>
-      </w:r>
-      <w:r>
-        <w:rPr>
-          <w:rFonts w:ascii="Times New Roman" w:hAnsi="Times New Roman" w:cs="Times New Roman"/>
-        </w:rPr>
-        <w:t xml:space="preserve"> </w:t>
-      </w:r>
-      <w:r>
-        <w:rPr>
-          <w:rFonts w:ascii="Times New Roman" w:hAnsi="Times New Roman" w:cs="Times New Roman"/>
-        </w:rPr>
-        <w:t>con</w:t>
-      </w:r>
-      <w:r>
-        <w:rPr>
-          <w:rFonts w:ascii="Times New Roman" w:hAnsi="Times New Roman" w:cs="Times New Roman"/>
-        </w:rPr>
-        <w:t xml:space="preserve"> </w:t>
-      </w:r>
-      <w:r>
-        <w:rPr>
-          <w:rFonts w:ascii="Times New Roman" w:hAnsi="Times New Roman" w:cs="Times New Roman"/>
-        </w:rPr>
-        <w:t>un</w:t>
-      </w:r>
-      <w:r>
-        <w:rPr>
-          <w:rFonts w:ascii="Times New Roman" w:hAnsi="Times New Roman" w:cs="Times New Roman"/>
-        </w:rPr>
-        <w:t xml:space="preserve"> </w:t>
-      </w:r>
-      <w:r>
-        <w:rPr>
-          <w:rFonts w:ascii="Times New Roman" w:hAnsi="Times New Roman" w:cs="Times New Roman"/>
-        </w:rPr>
-        <w:t>usuario</w:t>
-      </w:r>
-      <w:r>
-        <w:rPr>
-          <w:rFonts w:ascii="Times New Roman" w:hAnsi="Times New Roman" w:cs="Times New Roman"/>
-        </w:rPr>
-        <w:t xml:space="preserve"> </w:t>
-      </w:r>
-      <w:r>
-        <w:rPr>
-          <w:rFonts w:ascii="Times New Roman" w:hAnsi="Times New Roman" w:cs="Times New Roman"/>
-        </w:rPr>
-        <w:t>o</w:t>
-      </w:r>
-      <w:r>
-        <w:rPr>
-          <w:rFonts w:ascii="Times New Roman" w:hAnsi="Times New Roman" w:cs="Times New Roman"/>
-        </w:rPr>
-        <w:t xml:space="preserve"> </w:t>
-      </w:r>
-      <w:r>
-        <w:rPr>
-          <w:rFonts w:ascii="Times New Roman" w:hAnsi="Times New Roman" w:cs="Times New Roman"/>
-        </w:rPr>
-        <w:t>una</w:t>
-      </w:r>
-      <w:r>
-        <w:rPr>
-          <w:rFonts w:ascii="Times New Roman" w:hAnsi="Times New Roman" w:cs="Times New Roman"/>
-        </w:rPr>
-        <w:t xml:space="preserve"> </w:t>
-      </w:r>
-      <w:r>
-        <w:rPr>
-          <w:rFonts w:ascii="Times New Roman" w:hAnsi="Times New Roman" w:cs="Times New Roman"/>
-        </w:rPr>
-        <w:t>oferta,</w:t>
-      </w:r>
-      <w:r>
-        <w:rPr>
-          <w:rFonts w:ascii="Times New Roman" w:hAnsi="Times New Roman" w:cs="Times New Roman"/>
-        </w:rPr>
-        <w:t xml:space="preserve"> </w:t>
-      </w:r>
-      <w:r>
-        <w:rPr>
-          <w:rFonts w:ascii="Times New Roman" w:hAnsi="Times New Roman" w:cs="Times New Roman"/>
-        </w:rPr>
-        <w:t>y</w:t>
-      </w:r>
-      <w:r>
-        <w:rPr>
-          <w:rFonts w:ascii="Times New Roman" w:hAnsi="Times New Roman" w:cs="Times New Roman"/>
-        </w:rPr>
-        <w:t xml:space="preserve"> </w:t>
-      </w:r>
-      <w:r>
-        <w:rPr>
-          <w:rFonts w:ascii="Times New Roman" w:hAnsi="Times New Roman" w:cs="Times New Roman"/>
-        </w:rPr>
-        <w:t>las</w:t>
-      </w:r>
-      <w:r>
-        <w:rPr>
-          <w:rFonts w:ascii="Times New Roman" w:hAnsi="Times New Roman" w:cs="Times New Roman"/>
-        </w:rPr>
-        <w:t xml:space="preserve"> </w:t>
-      </w:r>
-      <w:r>
-        <w:rPr>
-          <w:rFonts w:ascii="Times New Roman" w:hAnsi="Times New Roman" w:cs="Times New Roman"/>
-        </w:rPr>
-        <w:t>medidas</w:t>
-      </w:r>
-      <w:r>
-        <w:rPr>
-          <w:rFonts w:ascii="Times New Roman" w:hAnsi="Times New Roman" w:cs="Times New Roman"/>
-        </w:rPr>
-        <w:t xml:space="preserve"> </w:t>
-      </w:r>
-      <w:r>
-        <w:rPr>
-          <w:rFonts w:ascii="Times New Roman" w:hAnsi="Times New Roman" w:cs="Times New Roman"/>
-        </w:rPr>
-        <w:t>de</w:t>
-      </w:r>
-      <w:r>
-        <w:rPr>
-          <w:rFonts w:ascii="Times New Roman" w:hAnsi="Times New Roman" w:cs="Times New Roman"/>
-        </w:rPr>
-        <w:t xml:space="preserve"> </w:t>
-      </w:r>
-      <w:r>
-        <w:rPr>
-          <w:rFonts w:ascii="Times New Roman" w:hAnsi="Times New Roman" w:cs="Times New Roman"/>
-        </w:rPr>
-        <w:t>seguridad</w:t>
-      </w:r>
-      <w:r>
-        <w:rPr>
-          <w:rFonts w:ascii="Times New Roman" w:hAnsi="Times New Roman" w:cs="Times New Roman"/>
-        </w:rPr>
-        <w:t xml:space="preserve"> </w:t>
-      </w:r>
-      <w:r>
-        <w:rPr>
-          <w:rFonts w:ascii="Times New Roman" w:hAnsi="Times New Roman" w:cs="Times New Roman"/>
-        </w:rPr>
-        <w:t>que</w:t>
-      </w:r>
-      <w:r>
-        <w:rPr>
-          <w:rFonts w:ascii="Times New Roman" w:hAnsi="Times New Roman" w:cs="Times New Roman"/>
-        </w:rPr>
-        <w:t xml:space="preserve"> </w:t>
-      </w:r>
-      <w:r>
-        <w:rPr>
-          <w:rFonts w:ascii="Times New Roman" w:hAnsi="Times New Roman" w:cs="Times New Roman"/>
-        </w:rPr>
-        <w:t>protegen</w:t>
-      </w:r>
-      <w:r>
-        <w:rPr>
-          <w:rFonts w:ascii="Times New Roman" w:hAnsi="Times New Roman" w:cs="Times New Roman"/>
-        </w:rPr>
-        <w:t xml:space="preserve"> </w:t>
-      </w:r>
-      <w:r>
-        <w:rPr>
-          <w:rFonts w:ascii="Times New Roman" w:hAnsi="Times New Roman" w:cs="Times New Roman"/>
-        </w:rPr>
-        <w:t>la</w:t>
-      </w:r>
-      <w:r>
-        <w:rPr>
-          <w:rFonts w:ascii="Times New Roman" w:hAnsi="Times New Roman" w:cs="Times New Roman"/>
-        </w:rPr>
-        <w:t xml:space="preserve"> </w:t>
-      </w:r>
-      <w:r>
-        <w:rPr>
-          <w:rFonts w:ascii="Times New Roman" w:hAnsi="Times New Roman" w:cs="Times New Roman"/>
-        </w:rPr>
-        <w:t>cuenta</w:t>
-      </w:r>
-      <w:r>
-        <w:rPr>
-          <w:rFonts w:ascii="Times New Roman" w:hAnsi="Times New Roman" w:cs="Times New Roman"/>
-        </w:rPr>
-        <w:t xml:space="preserve"> </w:t>
-      </w:r>
-      <w:r>
-        <w:rPr>
-          <w:rFonts w:ascii="Times New Roman" w:hAnsi="Times New Roman" w:cs="Times New Roman"/>
-        </w:rPr>
-        <w:t>(contraseña</w:t>
-      </w:r>
-      <w:r>
-        <w:rPr>
-          <w:rFonts w:ascii="Times New Roman" w:hAnsi="Times New Roman" w:cs="Times New Roman"/>
-        </w:rPr>
-        <w:t xml:space="preserve"> </w:t>
-      </w:r>
-      <w:r>
-        <w:rPr>
-          <w:rFonts w:ascii="Times New Roman" w:hAnsi="Times New Roman" w:cs="Times New Roman"/>
-        </w:rPr>
-        <w:t>cifrada,</w:t>
-      </w:r>
-      <w:r>
-        <w:rPr>
-          <w:rFonts w:ascii="Times New Roman" w:hAnsi="Times New Roman" w:cs="Times New Roman"/>
-        </w:rPr>
-        <w:t xml:space="preserve"> </w:t>
-      </w:r>
-      <w:r>
-        <w:rPr>
-          <w:rFonts w:ascii="Times New Roman" w:hAnsi="Times New Roman" w:cs="Times New Roman"/>
-        </w:rPr>
-        <w:t>sesión</w:t>
-      </w:r>
-      <w:r>
-        <w:rPr>
-          <w:rFonts w:ascii="Times New Roman" w:hAnsi="Times New Roman" w:cs="Times New Roman"/>
-        </w:rPr>
-        <w:t xml:space="preserve"> </w:t>
-      </w:r>
-      <w:r>
-        <w:rPr>
-          <w:rFonts w:ascii="Times New Roman" w:hAnsi="Times New Roman" w:cs="Times New Roman"/>
-        </w:rPr>
-        <w:t>protegida).</w:t>
-      </w:r>
-    </w:p>
-    <w:p>
-      <w:pPr>
-        <w:numPr>
-          <w:ilvl w:val="0"/>
-          <w:numId w:val="3"/>
-        </w:numPr>
-        <w:spacing w:line="360" w:lineRule="auto"/>
-        <w:rPr>
-          <w:rFonts w:ascii="Times New Roman" w:hAnsi="Times New Roman" w:cs="Times New Roman"/>
-        </w:rPr>
-      </w:pPr>
-      <w:r>
-        <w:rPr>
-          <w:rFonts w:ascii="Times New Roman" w:hAnsi="Times New Roman" w:cs="Times New Roman"/>
-          <w:b/>
-          <w:bCs/>
-        </w:rPr>
-        <w:t>Resolución</w:t>
-      </w:r>
-      <w:r>
-        <w:rPr>
-          <w:rFonts w:ascii="Times New Roman" w:hAnsi="Times New Roman" w:cs="Times New Roman"/>
-          <w:b/>
-          <w:bCs/>
-        </w:rPr>
-        <w:t xml:space="preserve"> </w:t>
-      </w:r>
-      <w:r>
-        <w:rPr>
-          <w:rFonts w:ascii="Times New Roman" w:hAnsi="Times New Roman" w:cs="Times New Roman"/>
-          <w:b/>
-          <w:bCs/>
-        </w:rPr>
-        <w:t>de</w:t>
-      </w:r>
-      <w:r>
-        <w:rPr>
-          <w:rFonts w:ascii="Times New Roman" w:hAnsi="Times New Roman" w:cs="Times New Roman"/>
-          <w:b/>
-          <w:bCs/>
-        </w:rPr>
-        <w:t xml:space="preserve"> </w:t>
-      </w:r>
-      <w:r>
-        <w:rPr>
-          <w:rFonts w:ascii="Times New Roman" w:hAnsi="Times New Roman" w:cs="Times New Roman"/>
-          <w:b/>
-          <w:bCs/>
-        </w:rPr>
-        <w:t>problemas</w:t>
-      </w:r>
-      <w:r>
-        <w:rPr>
-          <w:rFonts w:ascii="Times New Roman" w:hAnsi="Times New Roman" w:cs="Times New Roman"/>
-          <w:b/>
-          <w:bCs/>
-        </w:rPr>
-        <w:t xml:space="preserve"> </w:t>
-      </w:r>
-      <w:r>
-        <w:rPr>
-          <w:rFonts w:ascii="Times New Roman" w:hAnsi="Times New Roman" w:cs="Times New Roman"/>
-          <w:b/>
-          <w:bCs/>
-        </w:rPr>
-        <w:t>comunes.</w:t>
-      </w:r>
-      <w:r>
-        <w:rPr>
-          <w:rFonts w:ascii="Times New Roman" w:hAnsi="Times New Roman" w:cs="Times New Roman"/>
-        </w:rPr>
-        <w:t xml:space="preserve"> </w:t>
-      </w:r>
-      <w:r>
-        <w:rPr>
-          <w:rFonts w:ascii="Times New Roman" w:hAnsi="Times New Roman" w:cs="Times New Roman"/>
-        </w:rPr>
-        <w:t>Casos</w:t>
-      </w:r>
-      <w:r>
-        <w:rPr>
-          <w:rFonts w:ascii="Times New Roman" w:hAnsi="Times New Roman" w:cs="Times New Roman"/>
-        </w:rPr>
-        <w:t xml:space="preserve"> </w:t>
-      </w:r>
-      <w:r>
-        <w:rPr>
-          <w:rFonts w:ascii="Times New Roman" w:hAnsi="Times New Roman" w:cs="Times New Roman"/>
-        </w:rPr>
-        <w:t>frecuentes</w:t>
-      </w:r>
-      <w:r>
-        <w:rPr>
-          <w:rFonts w:ascii="Times New Roman" w:hAnsi="Times New Roman" w:cs="Times New Roman"/>
-        </w:rPr>
-        <w:t xml:space="preserve"> </w:t>
-      </w:r>
-      <w:r>
-        <w:rPr>
-          <w:rFonts w:ascii="Times New Roman" w:hAnsi="Times New Roman" w:cs="Times New Roman"/>
-        </w:rPr>
-        <w:t>durante</w:t>
-      </w:r>
-      <w:r>
-        <w:rPr>
-          <w:rFonts w:ascii="Times New Roman" w:hAnsi="Times New Roman" w:cs="Times New Roman"/>
-        </w:rPr>
-        <w:t xml:space="preserve"> </w:t>
-      </w:r>
-      <w:r>
-        <w:rPr>
-          <w:rFonts w:ascii="Times New Roman" w:hAnsi="Times New Roman" w:cs="Times New Roman"/>
-        </w:rPr>
-        <w:t>el</w:t>
-      </w:r>
-      <w:r>
-        <w:rPr>
-          <w:rFonts w:ascii="Times New Roman" w:hAnsi="Times New Roman" w:cs="Times New Roman"/>
-        </w:rPr>
-        <w:t xml:space="preserve"> </w:t>
-      </w:r>
-      <w:r>
-        <w:rPr>
-          <w:rFonts w:ascii="Times New Roman" w:hAnsi="Times New Roman" w:cs="Times New Roman"/>
-        </w:rPr>
-        <w:t>uso</w:t>
-      </w:r>
-      <w:r>
-        <w:rPr>
-          <w:rFonts w:ascii="Times New Roman" w:hAnsi="Times New Roman" w:cs="Times New Roman"/>
-        </w:rPr>
-        <w:t xml:space="preserve"> </w:t>
-      </w:r>
-      <w:r>
-        <w:rPr>
-          <w:rFonts w:ascii="Times New Roman" w:hAnsi="Times New Roman" w:cs="Times New Roman"/>
-        </w:rPr>
-        <w:t>(contraseña</w:t>
-      </w:r>
-      <w:r>
-        <w:rPr>
-          <w:rFonts w:ascii="Times New Roman" w:hAnsi="Times New Roman" w:cs="Times New Roman"/>
-        </w:rPr>
-        <w:t xml:space="preserve"> </w:t>
-      </w:r>
-      <w:r>
-        <w:rPr>
-          <w:rFonts w:ascii="Times New Roman" w:hAnsi="Times New Roman" w:cs="Times New Roman"/>
-        </w:rPr>
-        <w:t>olvidada,</w:t>
-      </w:r>
-      <w:r>
-        <w:rPr>
-          <w:rFonts w:ascii="Times New Roman" w:hAnsi="Times New Roman" w:cs="Times New Roman"/>
-        </w:rPr>
-        <w:t xml:space="preserve"> </w:t>
-      </w:r>
-      <w:r>
-        <w:rPr>
-          <w:rFonts w:ascii="Times New Roman" w:hAnsi="Times New Roman" w:cs="Times New Roman"/>
-        </w:rPr>
-        <w:t>oferta</w:t>
-      </w:r>
-      <w:r>
-        <w:rPr>
-          <w:rFonts w:ascii="Times New Roman" w:hAnsi="Times New Roman" w:cs="Times New Roman"/>
-        </w:rPr>
-        <w:t xml:space="preserve"> </w:t>
-      </w:r>
-      <w:r>
-        <w:rPr>
-          <w:rFonts w:ascii="Times New Roman" w:hAnsi="Times New Roman" w:cs="Times New Roman"/>
-        </w:rPr>
-        <w:t>que</w:t>
-      </w:r>
-      <w:r>
-        <w:rPr>
-          <w:rFonts w:ascii="Times New Roman" w:hAnsi="Times New Roman" w:cs="Times New Roman"/>
-        </w:rPr>
-        <w:t xml:space="preserve"> </w:t>
-      </w:r>
-      <w:r>
-        <w:rPr>
-          <w:rFonts w:ascii="Times New Roman" w:hAnsi="Times New Roman" w:cs="Times New Roman"/>
-        </w:rPr>
-        <w:t>no</w:t>
-      </w:r>
-      <w:r>
-        <w:rPr>
-          <w:rFonts w:ascii="Times New Roman" w:hAnsi="Times New Roman" w:cs="Times New Roman"/>
-        </w:rPr>
-        <w:t xml:space="preserve"> </w:t>
-      </w:r>
-      <w:r>
-        <w:rPr>
-          <w:rFonts w:ascii="Times New Roman" w:hAnsi="Times New Roman" w:cs="Times New Roman"/>
-        </w:rPr>
-        <w:t>aparece</w:t>
-      </w:r>
-      <w:r>
-        <w:rPr>
-          <w:rFonts w:ascii="Times New Roman" w:hAnsi="Times New Roman" w:cs="Times New Roman"/>
-        </w:rPr>
-        <w:t xml:space="preserve"> </w:t>
-      </w:r>
-      <w:r>
-        <w:rPr>
-          <w:rFonts w:ascii="Times New Roman" w:hAnsi="Times New Roman" w:cs="Times New Roman"/>
-        </w:rPr>
-        <w:t>en</w:t>
-      </w:r>
-      <w:r>
-        <w:rPr>
-          <w:rFonts w:ascii="Times New Roman" w:hAnsi="Times New Roman" w:cs="Times New Roman"/>
-        </w:rPr>
-        <w:t xml:space="preserve"> </w:t>
-      </w:r>
-      <w:r>
-        <w:rPr>
-          <w:rFonts w:ascii="Times New Roman" w:hAnsi="Times New Roman" w:cs="Times New Roman"/>
-        </w:rPr>
-        <w:t>el</w:t>
-      </w:r>
-      <w:r>
-        <w:rPr>
-          <w:rFonts w:ascii="Times New Roman" w:hAnsi="Times New Roman" w:cs="Times New Roman"/>
-        </w:rPr>
-        <w:t xml:space="preserve"> </w:t>
-      </w:r>
-      <w:r>
-        <w:rPr>
-          <w:rFonts w:ascii="Times New Roman" w:hAnsi="Times New Roman" w:cs="Times New Roman"/>
-        </w:rPr>
-        <w:t>buscador,</w:t>
-      </w:r>
-      <w:r>
-        <w:rPr>
-          <w:rFonts w:ascii="Times New Roman" w:hAnsi="Times New Roman" w:cs="Times New Roman"/>
-        </w:rPr>
-        <w:t xml:space="preserve"> </w:t>
-      </w:r>
-      <w:r>
-        <w:rPr>
-          <w:rFonts w:ascii="Times New Roman" w:hAnsi="Times New Roman" w:cs="Times New Roman"/>
-        </w:rPr>
-        <w:t>estado</w:t>
-      </w:r>
-      <w:r>
-        <w:rPr>
-          <w:rFonts w:ascii="Times New Roman" w:hAnsi="Times New Roman" w:cs="Times New Roman"/>
-        </w:rPr>
-        <w:t xml:space="preserve"> </w:t>
-      </w:r>
-      <w:r>
-        <w:rPr>
-          <w:rFonts w:ascii="Times New Roman" w:hAnsi="Times New Roman" w:cs="Times New Roman"/>
-        </w:rPr>
-        <w:t>de</w:t>
-      </w:r>
-      <w:r>
-        <w:rPr>
-          <w:rFonts w:ascii="Times New Roman" w:hAnsi="Times New Roman" w:cs="Times New Roman"/>
-        </w:rPr>
-        <w:t xml:space="preserve"> </w:t>
-      </w:r>
-      <w:r>
-        <w:rPr>
-          <w:rFonts w:ascii="Times New Roman" w:hAnsi="Times New Roman" w:cs="Times New Roman"/>
-        </w:rPr>
-        <w:t>un</w:t>
-      </w:r>
-      <w:r>
-        <w:rPr>
-          <w:rFonts w:ascii="Times New Roman" w:hAnsi="Times New Roman" w:cs="Times New Roman"/>
-        </w:rPr>
-        <w:t xml:space="preserve"> </w:t>
-      </w:r>
-      <w:r>
-        <w:rPr>
-          <w:rFonts w:ascii="Times New Roman" w:hAnsi="Times New Roman" w:cs="Times New Roman"/>
-        </w:rPr>
-        <w:t>trueque)</w:t>
-      </w:r>
-      <w:r>
-        <w:rPr>
-          <w:rFonts w:ascii="Times New Roman" w:hAnsi="Times New Roman" w:cs="Times New Roman"/>
-        </w:rPr>
-        <w:t xml:space="preserve"> </w:t>
-      </w:r>
-      <w:r>
-        <w:rPr>
-          <w:rFonts w:ascii="Times New Roman" w:hAnsi="Times New Roman" w:cs="Times New Roman"/>
-        </w:rPr>
-        <w:t>y</w:t>
-      </w:r>
-      <w:r>
-        <w:rPr>
-          <w:rFonts w:ascii="Times New Roman" w:hAnsi="Times New Roman" w:cs="Times New Roman"/>
-        </w:rPr>
-        <w:t xml:space="preserve"> </w:t>
-      </w:r>
-      <w:r>
-        <w:rPr>
-          <w:rFonts w:ascii="Times New Roman" w:hAnsi="Times New Roman" w:cs="Times New Roman"/>
-        </w:rPr>
-        <w:t>cómo</w:t>
-      </w:r>
-      <w:r>
-        <w:rPr>
-          <w:rFonts w:ascii="Times New Roman" w:hAnsi="Times New Roman" w:cs="Times New Roman"/>
-        </w:rPr>
-        <w:t xml:space="preserve"> </w:t>
-      </w:r>
-      <w:r>
-        <w:rPr>
-          <w:rFonts w:ascii="Times New Roman" w:hAnsi="Times New Roman" w:cs="Times New Roman"/>
-        </w:rPr>
-        <w:t>resolverlos</w:t>
-      </w:r>
-      <w:r>
-        <w:rPr>
-          <w:rFonts w:ascii="Times New Roman" w:hAnsi="Times New Roman" w:cs="Times New Roman"/>
-        </w:rPr>
-        <w:t xml:space="preserve"> </w:t>
-      </w:r>
-      <w:r>
-        <w:rPr>
-          <w:rFonts w:ascii="Times New Roman" w:hAnsi="Times New Roman" w:cs="Times New Roman"/>
-        </w:rPr>
-        <w:t>desde</w:t>
-      </w:r>
-      <w:r>
-        <w:rPr>
-          <w:rFonts w:ascii="Times New Roman" w:hAnsi="Times New Roman" w:cs="Times New Roman"/>
-        </w:rPr>
-        <w:t xml:space="preserve"> </w:t>
-      </w:r>
-      <w:r>
-        <w:rPr>
-          <w:rFonts w:ascii="Times New Roman" w:hAnsi="Times New Roman" w:cs="Times New Roman"/>
-        </w:rPr>
-        <w:t>la</w:t>
-      </w:r>
-      <w:r>
-        <w:rPr>
-          <w:rFonts w:ascii="Times New Roman" w:hAnsi="Times New Roman" w:cs="Times New Roman"/>
-        </w:rPr>
-        <w:t xml:space="preserve"> </w:t>
-      </w:r>
-      <w:r>
-        <w:rPr>
-          <w:rFonts w:ascii="Times New Roman" w:hAnsi="Times New Roman" w:cs="Times New Roman"/>
-        </w:rPr>
-        <w:t>misma</w:t>
-      </w:r>
-      <w:r>
-        <w:rPr>
-          <w:rFonts w:ascii="Times New Roman" w:hAnsi="Times New Roman" w:cs="Times New Roman"/>
-        </w:rPr>
-        <w:t xml:space="preserve"> </w:t>
-      </w:r>
-      <w:r>
-        <w:rPr>
-          <w:rFonts w:ascii="Times New Roman" w:hAnsi="Times New Roman" w:cs="Times New Roman"/>
-        </w:rPr>
-        <w:t>plataforma.</w:t>
       </w:r>
     </w:p>
     <w:p>
@@ -10838,9 +9235,9 @@
           <w:szCs w:val="28"/>
         </w:rPr>
       </w:pPr>
-      <w:bookmarkStart w:id="9" w:name="Xc6f3909ec5180fff6c210b95a88527723219234"/>
-      <w:bookmarkStart w:id="10" w:name="_Toc241697234"/>
-      <w:bookmarkEnd w:id="2"/>
+      <w:bookmarkStart w:id="9" w:name="_Toc241697234"/>
+      <w:bookmarkStart w:id="10" w:name="Xc6f3909ec5180fff6c210b95a88527723219234"/>
+      <w:bookmarkEnd w:id="3"/>
       <w:bookmarkEnd w:id="8"/>
       <w:r>
         <w:rPr>
@@ -10977,7 +9374,7 @@
         </w:rPr>
         <w:t>MATCH</w:t>
       </w:r>
-      <w:bookmarkEnd w:id="10"/>
+      <w:bookmarkEnd w:id="9"/>
     </w:p>
     <w:p>
       <w:pPr>
@@ -16808,9 +15205,9 @@
           <w:color w:val="000000" w:themeColor="text1"/>
         </w:rPr>
       </w:pPr>
-      <w:bookmarkStart w:id="16" w:name="referencias"/>
-      <w:bookmarkStart w:id="17" w:name="_Toc241697235"/>
-      <w:bookmarkEnd w:id="9"/>
+      <w:bookmarkStart w:id="16" w:name="_Toc241697235"/>
+      <w:bookmarkStart w:id="17" w:name="referencias"/>
+      <w:bookmarkEnd w:id="10"/>
       <w:bookmarkEnd w:id="15"/>
       <w:r>
         <w:rPr>
@@ -16818,7 +15215,7 @@
         </w:rPr>
         <w:t>Referencias</w:t>
       </w:r>
-      <w:bookmarkEnd w:id="17"/>
+      <w:bookmarkEnd w:id="16"/>
     </w:p>
     <w:p>
       <w:pPr>
@@ -18120,7 +16517,7 @@
         </w:rPr>
         <w:t>https://github.com/lopezoviedogersonjonnathan-rgb/proyecto_sena</w:t>
       </w:r>
-      <w:bookmarkEnd w:id="16"/>
+      <w:bookmarkEnd w:id="17"/>
     </w:p>
     <w:sectPr>
       <w:footerReference w:type="default" r:id="rId8"/>
@@ -18974,6 +17371,7 @@
   <w:style w:type="character" w:default="1" w:styleId="Fuentedeprrafopredeter">
     <w:name w:val="Default Paragraph Font"/>
     <w:uiPriority w:val="1"/>
+    <w:semiHidden/>
     <w:unhideWhenUsed/>
   </w:style>
   <w:style w:type="table" w:default="1" w:styleId="Tablanormal">

</xml_diff>